<commit_message>
Update AI Studio workflow scripts
</commit_message>
<xml_diff>
--- a/.opencode/skills/AIU_Studio_Skill_Explanation_Table.docx
+++ b/.opencode/skills/AIU_Studio_Skill_Explanation_Table.docx
@@ -4,42 +4,17 @@
   <w:body>
     <w:p>
       <w:pPr>
-        <w:spacing w:after="160"/>
-        <w:jc w:val="left"/>
+        <w:pStyle w:val="Heading1"/>
       </w:pPr>
       <w:r>
-        <w:rPr>
-          <w:rFonts w:ascii="Arial" w:hAnsi="Arial"/>
-          <w:b/>
-          <w:sz w:val="44"/>
-        </w:rPr>
         <w:t>AIU Studio Skill Explanation Table</w:t>
       </w:r>
     </w:p>
     <w:p>
       <w:pPr>
-        <w:spacing w:after="280"/>
+        <w:pStyle w:val="Heading2"/>
       </w:pPr>
       <w:r>
-        <w:rPr>
-          <w:rFonts w:ascii="Arial" w:hAnsi="Arial"/>
-          <w:b w:val="0"/>
-          <w:sz w:val="22"/>
-        </w:rPr>
-        <w:t>보고용 / 설명용 문서</w:t>
-      </w:r>
-    </w:p>
-    <w:p>
-      <w:pPr>
-        <w:pStyle w:val="Heading1"/>
-        <w:spacing w:before="200" w:after="120"/>
-      </w:pPr>
-      <w:r>
-        <w:rPr>
-          <w:rFonts w:ascii="Arial" w:hAnsi="Arial"/>
-          <w:b/>
-          <w:sz w:val="28"/>
-        </w:rPr>
         <w:t>1. 스킬 문서 설명</w:t>
       </w:r>
     </w:p>
@@ -47,134 +22,73 @@
       <w:tblPr>
         <w:tblStyle w:val="TableGrid"/>
         <w:tblW w:type="auto" w:w="0"/>
-        <w:tblLayout w:type="fixed"/>
         <w:tblLook w:firstColumn="1" w:firstRow="1" w:lastColumn="0" w:lastRow="0" w:noHBand="0" w:noVBand="1" w:val="04A0"/>
       </w:tblPr>
       <w:tblGrid>
-        <w:gridCol w:w="1560"/>
-        <w:gridCol w:w="1560"/>
-        <w:gridCol w:w="1560"/>
-        <w:gridCol w:w="1560"/>
-        <w:gridCol w:w="1560"/>
-        <w:gridCol w:w="1560"/>
+        <w:gridCol w:w="1440"/>
+        <w:gridCol w:w="1440"/>
+        <w:gridCol w:w="1440"/>
+        <w:gridCol w:w="1440"/>
+        <w:gridCol w:w="1440"/>
+        <w:gridCol w:w="1440"/>
       </w:tblGrid>
       <w:tr>
         <w:tc>
           <w:tcPr>
-            <w:tcW w:type="dxa" w:w="648"/>
-            <w:shd w:fill="D9EAF7"/>
+            <w:tcW w:type="dxa" w:w="1440"/>
           </w:tcPr>
           <w:p>
-            <w:pPr>
-              <w:jc w:val="center"/>
-            </w:pPr>
-            <w:r/>
             <w:r>
-              <w:rPr>
-                <w:rFonts w:ascii="Arial" w:hAnsi="Arial"/>
-                <w:b/>
-                <w:sz w:val="19"/>
-              </w:rPr>
               <w:t>번호</w:t>
             </w:r>
           </w:p>
         </w:tc>
         <w:tc>
           <w:tcPr>
-            <w:tcW w:type="dxa" w:w="2088"/>
-            <w:shd w:fill="D9EAF7"/>
+            <w:tcW w:type="dxa" w:w="1440"/>
           </w:tcPr>
           <w:p>
-            <w:pPr>
-              <w:jc w:val="center"/>
-            </w:pPr>
-            <w:r/>
             <w:r>
-              <w:rPr>
-                <w:rFonts w:ascii="Arial" w:hAnsi="Arial"/>
-                <w:b/>
-                <w:sz w:val="19"/>
-              </w:rPr>
               <w:t>스킬 문서</w:t>
             </w:r>
           </w:p>
         </w:tc>
         <w:tc>
           <w:tcPr>
-            <w:tcW w:type="dxa" w:w="1944"/>
-            <w:shd w:fill="D9EAF7"/>
+            <w:tcW w:type="dxa" w:w="1440"/>
           </w:tcPr>
           <w:p>
-            <w:pPr>
-              <w:jc w:val="center"/>
-            </w:pPr>
-            <w:r/>
             <w:r>
-              <w:rPr>
-                <w:rFonts w:ascii="Arial" w:hAnsi="Arial"/>
-                <w:b/>
-                <w:sz w:val="19"/>
-              </w:rPr>
               <w:t>언제 사용하는지</w:t>
             </w:r>
           </w:p>
         </w:tc>
         <w:tc>
           <w:tcPr>
-            <w:tcW w:type="dxa" w:w="1584"/>
-            <w:shd w:fill="D9EAF7"/>
+            <w:tcW w:type="dxa" w:w="1440"/>
           </w:tcPr>
           <w:p>
-            <w:pPr>
-              <w:jc w:val="center"/>
-            </w:pPr>
-            <w:r/>
             <w:r>
-              <w:rPr>
-                <w:rFonts w:ascii="Arial" w:hAnsi="Arial"/>
-                <w:b/>
-                <w:sz w:val="19"/>
-              </w:rPr>
               <w:t>주요 입력</w:t>
             </w:r>
           </w:p>
         </w:tc>
         <w:tc>
           <w:tcPr>
-            <w:tcW w:type="dxa" w:w="2015"/>
-            <w:shd w:fill="D9EAF7"/>
+            <w:tcW w:type="dxa" w:w="1440"/>
           </w:tcPr>
           <w:p>
-            <w:pPr>
-              <w:jc w:val="center"/>
-            </w:pPr>
-            <w:r/>
             <w:r>
-              <w:rPr>
-                <w:rFonts w:ascii="Arial" w:hAnsi="Arial"/>
-                <w:b/>
-                <w:sz w:val="19"/>
-              </w:rPr>
               <w:t>하는 일</w:t>
             </w:r>
           </w:p>
         </w:tc>
         <w:tc>
           <w:tcPr>
-            <w:tcW w:type="dxa" w:w="1800"/>
-            <w:shd w:fill="D9EAF7"/>
+            <w:tcW w:type="dxa" w:w="1440"/>
           </w:tcPr>
           <w:p>
-            <w:pPr>
-              <w:jc w:val="center"/>
-            </w:pPr>
-            <w:r/>
             <w:r>
-              <w:rPr>
-                <w:rFonts w:ascii="Arial" w:hAnsi="Arial"/>
-                <w:b/>
-                <w:sz w:val="19"/>
-              </w:rPr>
               <w:t>주요 결과</w:t>
             </w:r>
           </w:p>
@@ -183,114 +97,60 @@
       <w:tr>
         <w:tc>
           <w:tcPr>
-            <w:tcW w:type="dxa" w:w="648"/>
+            <w:tcW w:type="dxa" w:w="1440"/>
           </w:tcPr>
           <w:p>
-            <w:pPr>
-              <w:jc w:val="left"/>
-            </w:pPr>
-            <w:r/>
             <w:r>
-              <w:rPr>
-                <w:rFonts w:ascii="Arial" w:hAnsi="Arial"/>
-                <w:b w:val="0"/>
-                <w:sz w:val="19"/>
-              </w:rPr>
               <w:t>1</w:t>
             </w:r>
           </w:p>
         </w:tc>
         <w:tc>
           <w:tcPr>
-            <w:tcW w:type="dxa" w:w="2088"/>
+            <w:tcW w:type="dxa" w:w="1440"/>
           </w:tcPr>
           <w:p>
-            <w:pPr>
-              <w:jc w:val="left"/>
-            </w:pPr>
-            <w:r/>
             <w:r>
-              <w:rPr>
-                <w:rFonts w:ascii="Arial" w:hAnsi="Arial"/>
-                <w:b w:val="0"/>
-                <w:sz w:val="19"/>
-              </w:rPr>
               <w:t>01-agent-mlflow-skill-project-analyze</w:t>
             </w:r>
           </w:p>
         </w:tc>
         <w:tc>
           <w:tcPr>
-            <w:tcW w:type="dxa" w:w="1944"/>
+            <w:tcW w:type="dxa" w:w="1440"/>
           </w:tcPr>
           <w:p>
-            <w:pPr>
-              <w:jc w:val="left"/>
-            </w:pPr>
-            <w:r/>
             <w:r>
-              <w:rPr>
-                <w:rFonts w:ascii="Arial" w:hAnsi="Arial"/>
-                <w:b w:val="0"/>
-                <w:sz w:val="19"/>
-              </w:rPr>
               <w:t>처음 진입했을 때, 모델 있음/없음 확인이 필요할 때</w:t>
             </w:r>
           </w:p>
         </w:tc>
         <w:tc>
           <w:tcPr>
-            <w:tcW w:type="dxa" w:w="1584"/>
+            <w:tcW w:type="dxa" w:w="1440"/>
           </w:tcPr>
           <w:p>
-            <w:pPr>
-              <w:jc w:val="left"/>
-            </w:pPr>
-            <w:r/>
             <w:r>
-              <w:rPr>
-                <w:rFonts w:ascii="Arial" w:hAnsi="Arial"/>
-                <w:b w:val="0"/>
-                <w:sz w:val="19"/>
-              </w:rPr>
               <w:t>현재 워크스페이스, 프로젝트 루트</w:t>
             </w:r>
           </w:p>
         </w:tc>
         <w:tc>
           <w:tcPr>
-            <w:tcW w:type="dxa" w:w="2015"/>
+            <w:tcW w:type="dxa" w:w="1440"/>
           </w:tcPr>
           <w:p>
-            <w:pPr>
-              <w:jc w:val="left"/>
-            </w:pPr>
-            <w:r/>
             <w:r>
-              <w:rPr>
-                <w:rFonts w:ascii="Arial" w:hAnsi="Arial"/>
-                <w:b w:val="0"/>
-                <w:sz w:val="19"/>
-              </w:rPr>
               <w:t>워크스페이스를 분석하고 모델 파일, 실행 파일, 구조 상태를 확인</w:t>
             </w:r>
           </w:p>
         </w:tc>
         <w:tc>
           <w:tcPr>
-            <w:tcW w:type="dxa" w:w="1800"/>
+            <w:tcW w:type="dxa" w:w="1440"/>
           </w:tcPr>
           <w:p>
-            <w:pPr>
-              <w:jc w:val="left"/>
-            </w:pPr>
-            <w:r/>
             <w:r>
-              <w:rPr>
-                <w:rFonts w:ascii="Arial" w:hAnsi="Arial"/>
-                <w:b w:val="0"/>
-                <w:sz w:val="19"/>
-              </w:rPr>
               <w:t>model_found, 모델 목록, 점검 결과</w:t>
             </w:r>
           </w:p>
@@ -299,114 +159,60 @@
       <w:tr>
         <w:tc>
           <w:tcPr>
-            <w:tcW w:type="dxa" w:w="648"/>
+            <w:tcW w:type="dxa" w:w="1440"/>
           </w:tcPr>
           <w:p>
-            <w:pPr>
-              <w:jc w:val="left"/>
-            </w:pPr>
-            <w:r/>
             <w:r>
-              <w:rPr>
-                <w:rFonts w:ascii="Arial" w:hAnsi="Arial"/>
-                <w:b w:val="0"/>
-                <w:sz w:val="19"/>
-              </w:rPr>
               <w:t>2</w:t>
             </w:r>
           </w:p>
         </w:tc>
         <w:tc>
           <w:tcPr>
-            <w:tcW w:type="dxa" w:w="2088"/>
+            <w:tcW w:type="dxa" w:w="1440"/>
           </w:tcPr>
           <w:p>
-            <w:pPr>
-              <w:jc w:val="left"/>
-            </w:pPr>
-            <w:r/>
             <w:r>
-              <w:rPr>
-                <w:rFonts w:ascii="Arial" w:hAnsi="Arial"/>
-                <w:b w:val="0"/>
-                <w:sz w:val="19"/>
-              </w:rPr>
               <w:t>02-agent-mlflow-skill-sample-bootstrap</w:t>
             </w:r>
           </w:p>
         </w:tc>
         <w:tc>
           <w:tcPr>
-            <w:tcW w:type="dxa" w:w="1944"/>
+            <w:tcW w:type="dxa" w:w="1440"/>
           </w:tcPr>
           <w:p>
-            <w:pPr>
-              <w:jc w:val="left"/>
-            </w:pPr>
-            <w:r/>
             <w:r>
-              <w:rPr>
-                <w:rFonts w:ascii="Arial" w:hAnsi="Arial"/>
-                <w:b w:val="0"/>
-                <w:sz w:val="19"/>
-              </w:rPr>
               <w:t>모델이 없어서 샘플을 복사해야 할 때</w:t>
             </w:r>
           </w:p>
         </w:tc>
         <w:tc>
           <w:tcPr>
-            <w:tcW w:type="dxa" w:w="1584"/>
+            <w:tcW w:type="dxa" w:w="1440"/>
           </w:tcPr>
           <w:p>
-            <w:pPr>
-              <w:jc w:val="left"/>
-            </w:pPr>
-            <w:r/>
             <w:r>
-              <w:rPr>
-                <w:rFonts w:ascii="Arial" w:hAnsi="Arial"/>
-                <w:b w:val="0"/>
-                <w:sz w:val="19"/>
-              </w:rPr>
               <w:t>샘플 종류(sklearn, pytorch, tensorflow), 워크스페이스 루트</w:t>
             </w:r>
           </w:p>
         </w:tc>
         <w:tc>
           <w:tcPr>
-            <w:tcW w:type="dxa" w:w="2015"/>
+            <w:tcW w:type="dxa" w:w="1440"/>
           </w:tcPr>
           <w:p>
-            <w:pPr>
-              <w:jc w:val="left"/>
-            </w:pPr>
-            <w:r/>
             <w:r>
-              <w:rPr>
-                <w:rFonts w:ascii="Arial" w:hAnsi="Arial"/>
-                <w:b w:val="0"/>
-                <w:sz w:val="19"/>
-              </w:rPr>
               <w:t>샘플 또는 템플릿 파일을 워크스페이스로 복사</w:t>
             </w:r>
           </w:p>
         </w:tc>
         <w:tc>
           <w:tcPr>
-            <w:tcW w:type="dxa" w:w="1800"/>
+            <w:tcW w:type="dxa" w:w="1440"/>
           </w:tcPr>
           <w:p>
-            <w:pPr>
-              <w:jc w:val="left"/>
-            </w:pPr>
-            <w:r/>
             <w:r>
-              <w:rPr>
-                <w:rFonts w:ascii="Arial" w:hAnsi="Arial"/>
-                <w:b w:val="0"/>
-                <w:sz w:val="19"/>
-              </w:rPr>
               <w:t>샘플 구조, 기본 템플릿 파일</w:t>
             </w:r>
           </w:p>
@@ -415,114 +221,60 @@
       <w:tr>
         <w:tc>
           <w:tcPr>
-            <w:tcW w:type="dxa" w:w="648"/>
+            <w:tcW w:type="dxa" w:w="1440"/>
           </w:tcPr>
           <w:p>
-            <w:pPr>
-              <w:jc w:val="left"/>
-            </w:pPr>
-            <w:r/>
             <w:r>
-              <w:rPr>
-                <w:rFonts w:ascii="Arial" w:hAnsi="Arial"/>
-                <w:b w:val="0"/>
-                <w:sz w:val="19"/>
-              </w:rPr>
               <w:t>3</w:t>
             </w:r>
           </w:p>
         </w:tc>
         <w:tc>
           <w:tcPr>
-            <w:tcW w:type="dxa" w:w="2088"/>
+            <w:tcW w:type="dxa" w:w="1440"/>
           </w:tcPr>
           <w:p>
-            <w:pPr>
-              <w:jc w:val="left"/>
-            </w:pPr>
-            <w:r/>
             <w:r>
-              <w:rPr>
-                <w:rFonts w:ascii="Arial" w:hAnsi="Arial"/>
-                <w:b w:val="0"/>
-                <w:sz w:val="19"/>
-              </w:rPr>
               <w:t>03-agent-mlflow-skill-environment-check</w:t>
             </w:r>
           </w:p>
         </w:tc>
         <w:tc>
           <w:tcPr>
-            <w:tcW w:type="dxa" w:w="1944"/>
+            <w:tcW w:type="dxa" w:w="1440"/>
           </w:tcPr>
           <w:p>
-            <w:pPr>
-              <w:jc w:val="left"/>
-            </w:pPr>
-            <w:r/>
             <w:r>
-              <w:rPr>
-                <w:rFonts w:ascii="Arial" w:hAnsi="Arial"/>
-                <w:b w:val="0"/>
-                <w:sz w:val="19"/>
-              </w:rPr>
               <w:t>모델 선택/템플릿 변환 후 환경 점검이 필요할 때</w:t>
             </w:r>
           </w:p>
         </w:tc>
         <w:tc>
           <w:tcPr>
-            <w:tcW w:type="dxa" w:w="1584"/>
+            <w:tcW w:type="dxa" w:w="1440"/>
           </w:tcPr>
           <w:p>
-            <w:pPr>
-              <w:jc w:val="left"/>
-            </w:pPr>
-            <w:r/>
             <w:r>
-              <w:rPr>
-                <w:rFonts w:ascii="Arial" w:hAnsi="Arial"/>
-                <w:b w:val="0"/>
-                <w:sz w:val="19"/>
-              </w:rPr>
               <w:t>runtest_2.py, requirements.txt, MLflow 입력값</w:t>
             </w:r>
           </w:p>
         </w:tc>
         <w:tc>
           <w:tcPr>
-            <w:tcW w:type="dxa" w:w="2015"/>
+            <w:tcW w:type="dxa" w:w="1440"/>
           </w:tcPr>
           <w:p>
-            <w:pPr>
-              <w:jc w:val="left"/>
-            </w:pPr>
-            <w:r/>
             <w:r>
-              <w:rPr>
-                <w:rFonts w:ascii="Arial" w:hAnsi="Arial"/>
-                <w:b w:val="0"/>
-                <w:sz w:val="19"/>
-              </w:rPr>
               <w:t>Python 버전, 패키지, MLflow 입력값, requirements 상태를 점검</w:t>
             </w:r>
           </w:p>
         </w:tc>
         <w:tc>
           <w:tcPr>
-            <w:tcW w:type="dxa" w:w="1800"/>
+            <w:tcW w:type="dxa" w:w="1440"/>
           </w:tcPr>
           <w:p>
-            <w:pPr>
-              <w:jc w:val="left"/>
-            </w:pPr>
-            <w:r/>
             <w:r>
-              <w:rPr>
-                <w:rFonts w:ascii="Arial" w:hAnsi="Arial"/>
-                <w:b w:val="0"/>
-                <w:sz w:val="19"/>
-              </w:rPr>
               <w:t>환경 점검 결과, requirements.txt 갱신</w:t>
             </w:r>
           </w:p>
@@ -531,114 +283,60 @@
       <w:tr>
         <w:tc>
           <w:tcPr>
-            <w:tcW w:type="dxa" w:w="648"/>
+            <w:tcW w:type="dxa" w:w="1440"/>
           </w:tcPr>
           <w:p>
-            <w:pPr>
-              <w:jc w:val="left"/>
-            </w:pPr>
-            <w:r/>
             <w:r>
-              <w:rPr>
-                <w:rFonts w:ascii="Arial" w:hAnsi="Arial"/>
-                <w:b w:val="0"/>
-                <w:sz w:val="19"/>
-              </w:rPr>
               <w:t>4</w:t>
             </w:r>
           </w:p>
         </w:tc>
         <w:tc>
           <w:tcPr>
-            <w:tcW w:type="dxa" w:w="2088"/>
+            <w:tcW w:type="dxa" w:w="1440"/>
           </w:tcPr>
           <w:p>
-            <w:pPr>
-              <w:jc w:val="left"/>
-            </w:pPr>
-            <w:r/>
             <w:r>
-              <w:rPr>
-                <w:rFonts w:ascii="Arial" w:hAnsi="Arial"/>
-                <w:b w:val="0"/>
-                <w:sz w:val="19"/>
-              </w:rPr>
               <w:t>04-agent-mlflow-skill-train-model</w:t>
             </w:r>
           </w:p>
         </w:tc>
         <w:tc>
           <w:tcPr>
-            <w:tcW w:type="dxa" w:w="1944"/>
+            <w:tcW w:type="dxa" w:w="1440"/>
           </w:tcPr>
           <w:p>
-            <w:pPr>
-              <w:jc w:val="left"/>
-            </w:pPr>
-            <w:r/>
             <w:r>
-              <w:rPr>
-                <w:rFonts w:ascii="Arial" w:hAnsi="Arial"/>
-                <w:b w:val="0"/>
-                <w:sz w:val="19"/>
-              </w:rPr>
               <w:t>모델을 선택하고 실행 준비를 해야 할 때</w:t>
             </w:r>
           </w:p>
         </w:tc>
         <w:tc>
           <w:tcPr>
-            <w:tcW w:type="dxa" w:w="1584"/>
+            <w:tcW w:type="dxa" w:w="1440"/>
           </w:tcPr>
           <w:p>
-            <w:pPr>
-              <w:jc w:val="left"/>
-            </w:pPr>
-            <w:r/>
             <w:r>
-              <w:rPr>
-                <w:rFonts w:ascii="Arial" w:hAnsi="Arial"/>
-                <w:b w:val="0"/>
-                <w:sz w:val="19"/>
-              </w:rPr>
               <w:t>선택 모델 경로, runtest.py, 워크스페이스 루트</w:t>
             </w:r>
           </w:p>
         </w:tc>
         <w:tc>
           <w:tcPr>
-            <w:tcW w:type="dxa" w:w="2015"/>
+            <w:tcW w:type="dxa" w:w="1440"/>
           </w:tcPr>
           <w:p>
-            <w:pPr>
-              <w:jc w:val="left"/>
-            </w:pPr>
-            <w:r/>
             <w:r>
-              <w:rPr>
-                <w:rFonts w:ascii="Arial" w:hAnsi="Arial"/>
-                <w:b w:val="0"/>
-                <w:sz w:val="19"/>
-              </w:rPr>
               <w:t>runtest_2.py를 생성하고 템플릿을 선택 모델 기준으로 변환</w:t>
             </w:r>
           </w:p>
         </w:tc>
         <w:tc>
           <w:tcPr>
-            <w:tcW w:type="dxa" w:w="1800"/>
+            <w:tcW w:type="dxa" w:w="1440"/>
           </w:tcPr>
           <w:p>
-            <w:pPr>
-              <w:jc w:val="left"/>
-            </w:pPr>
-            <w:r/>
             <w:r>
-              <w:rPr>
-                <w:rFonts w:ascii="Arial" w:hAnsi="Arial"/>
-                <w:b w:val="0"/>
-                <w:sz w:val="19"/>
-              </w:rPr>
               <w:t>runtest_2.py, aiu_custom/, local_serving/, saved_model/</w:t>
             </w:r>
           </w:p>
@@ -647,248 +345,71 @@
       <w:tr>
         <w:tc>
           <w:tcPr>
-            <w:tcW w:type="dxa" w:w="648"/>
+            <w:tcW w:type="dxa" w:w="1440"/>
           </w:tcPr>
           <w:p>
-            <w:pPr>
-              <w:jc w:val="left"/>
-            </w:pPr>
-            <w:r/>
             <w:r>
-              <w:rPr>
-                <w:rFonts w:ascii="Arial" w:hAnsi="Arial"/>
-                <w:b w:val="0"/>
-                <w:sz w:val="19"/>
-              </w:rPr>
               <w:t>5</w:t>
             </w:r>
           </w:p>
         </w:tc>
         <w:tc>
           <w:tcPr>
-            <w:tcW w:type="dxa" w:w="2088"/>
+            <w:tcW w:type="dxa" w:w="1440"/>
           </w:tcPr>
           <w:p>
-            <w:pPr>
-              <w:jc w:val="left"/>
-            </w:pPr>
-            <w:r/>
             <w:r>
-              <w:rPr>
-                <w:rFonts w:ascii="Arial" w:hAnsi="Arial"/>
-                <w:b w:val="0"/>
-                <w:sz w:val="19"/>
-              </w:rPr>
               <w:t>05-agent-mlflow-skill-inference-test</w:t>
             </w:r>
           </w:p>
         </w:tc>
         <w:tc>
           <w:tcPr>
-            <w:tcW w:type="dxa" w:w="1944"/>
+            <w:tcW w:type="dxa" w:w="1440"/>
           </w:tcPr>
           <w:p>
-            <w:pPr>
-              <w:jc w:val="left"/>
-            </w:pPr>
-            <w:r/>
             <w:r>
-              <w:rPr>
-                <w:rFonts w:ascii="Arial" w:hAnsi="Arial"/>
-                <w:b w:val="0"/>
-                <w:sz w:val="19"/>
-              </w:rPr>
               <w:t>MLflow 등록 후 추론 테스트를 해야 할 때</w:t>
             </w:r>
           </w:p>
         </w:tc>
         <w:tc>
           <w:tcPr>
-            <w:tcW w:type="dxa" w:w="1584"/>
+            <w:tcW w:type="dxa" w:w="1440"/>
           </w:tcPr>
           <w:p>
-            <w:pPr>
-              <w:jc w:val="left"/>
-            </w:pPr>
-            <w:r/>
             <w:r>
-              <w:rPr>
-                <w:rFonts w:ascii="Arial" w:hAnsi="Arial"/>
-                <w:b w:val="0"/>
-                <w:sz w:val="19"/>
-              </w:rPr>
               <w:t>local_serving/localservingtest.py, 입력 예시</w:t>
             </w:r>
           </w:p>
         </w:tc>
         <w:tc>
           <w:tcPr>
-            <w:tcW w:type="dxa" w:w="2015"/>
+            <w:tcW w:type="dxa" w:w="1440"/>
           </w:tcPr>
           <w:p>
-            <w:pPr>
-              <w:jc w:val="left"/>
-            </w:pPr>
-            <w:r/>
             <w:r>
-              <w:rPr>
-                <w:rFonts w:ascii="Arial" w:hAnsi="Arial"/>
-                <w:b w:val="0"/>
-                <w:sz w:val="19"/>
-              </w:rPr>
               <w:t>로컬 추론 입력/출력 스키마와 predict 동작을 확인</w:t>
             </w:r>
           </w:p>
         </w:tc>
         <w:tc>
           <w:tcPr>
-            <w:tcW w:type="dxa" w:w="1800"/>
+            <w:tcW w:type="dxa" w:w="1440"/>
           </w:tcPr>
           <w:p>
-            <w:pPr>
-              <w:jc w:val="left"/>
-            </w:pPr>
-            <w:r/>
             <w:r>
-              <w:rPr>
-                <w:rFonts w:ascii="Arial" w:hAnsi="Arial"/>
-                <w:b w:val="0"/>
-                <w:sz w:val="19"/>
-              </w:rPr>
               <w:t>추론 테스트 결과</w:t>
             </w:r>
           </w:p>
         </w:tc>
       </w:tr>
-      <w:tr>
-        <w:tc>
-          <w:tcPr>
-            <w:tcW w:type="dxa" w:w="648"/>
-          </w:tcPr>
-          <w:p>
-            <w:pPr>
-              <w:jc w:val="left"/>
-            </w:pPr>
-            <w:r/>
-            <w:r>
-              <w:rPr>
-                <w:rFonts w:ascii="Arial" w:hAnsi="Arial"/>
-                <w:b w:val="0"/>
-                <w:sz w:val="19"/>
-              </w:rPr>
-              <w:t>6</w:t>
-            </w:r>
-          </w:p>
-        </w:tc>
-        <w:tc>
-          <w:tcPr>
-            <w:tcW w:type="dxa" w:w="2088"/>
-          </w:tcPr>
-          <w:p>
-            <w:pPr>
-              <w:jc w:val="left"/>
-            </w:pPr>
-            <w:r/>
-            <w:r>
-              <w:rPr>
-                <w:rFonts w:ascii="Arial" w:hAnsi="Arial"/>
-                <w:b w:val="0"/>
-                <w:sz w:val="19"/>
-              </w:rPr>
-              <w:t>06-agent-mlflow-skill-mlflow-verify</w:t>
-            </w:r>
-          </w:p>
-        </w:tc>
-        <w:tc>
-          <w:tcPr>
-            <w:tcW w:type="dxa" w:w="1944"/>
-          </w:tcPr>
-          <w:p>
-            <w:pPr>
-              <w:jc w:val="left"/>
-            </w:pPr>
-            <w:r/>
-            <w:r>
-              <w:rPr>
-                <w:rFonts w:ascii="Arial" w:hAnsi="Arial"/>
-                <w:b w:val="0"/>
-                <w:sz w:val="19"/>
-              </w:rPr>
-              <w:t>MLflow 결과를 별도로 검증해야 할 때</w:t>
-            </w:r>
-          </w:p>
-        </w:tc>
-        <w:tc>
-          <w:tcPr>
-            <w:tcW w:type="dxa" w:w="1584"/>
-          </w:tcPr>
-          <w:p>
-            <w:pPr>
-              <w:jc w:val="left"/>
-            </w:pPr>
-            <w:r/>
-            <w:r>
-              <w:rPr>
-                <w:rFonts w:ascii="Arial" w:hAnsi="Arial"/>
-                <w:b w:val="0"/>
-                <w:sz w:val="19"/>
-              </w:rPr>
-              <w:t>tracking URI, experiment name, registered model name</w:t>
-            </w:r>
-          </w:p>
-        </w:tc>
-        <w:tc>
-          <w:tcPr>
-            <w:tcW w:type="dxa" w:w="2015"/>
-          </w:tcPr>
-          <w:p>
-            <w:pPr>
-              <w:jc w:val="left"/>
-            </w:pPr>
-            <w:r/>
-            <w:r>
-              <w:rPr>
-                <w:rFonts w:ascii="Arial" w:hAnsi="Arial"/>
-                <w:b w:val="0"/>
-                <w:sz w:val="19"/>
-              </w:rPr>
-              <w:t>experiment, run, artifact, registered model 상태를 확인</w:t>
-            </w:r>
-          </w:p>
-        </w:tc>
-        <w:tc>
-          <w:tcPr>
-            <w:tcW w:type="dxa" w:w="1800"/>
-          </w:tcPr>
-          <w:p>
-            <w:pPr>
-              <w:jc w:val="left"/>
-            </w:pPr>
-            <w:r/>
-            <w:r>
-              <w:rPr>
-                <w:rFonts w:ascii="Arial" w:hAnsi="Arial"/>
-                <w:b w:val="0"/>
-                <w:sz w:val="19"/>
-              </w:rPr>
-              <w:t>MLflow 검증 결과</w:t>
-            </w:r>
-          </w:p>
-        </w:tc>
-      </w:tr>
     </w:tbl>
-    <w:p/>
     <w:p>
       <w:pPr>
-        <w:pStyle w:val="Heading1"/>
-        <w:spacing w:before="200" w:after="120"/>
+        <w:pStyle w:val="Heading2"/>
       </w:pPr>
       <w:r>
-        <w:rPr>
-          <w:rFonts w:ascii="Arial" w:hAnsi="Arial"/>
-          <w:b/>
-          <w:sz w:val="28"/>
-        </w:rPr>
         <w:t>2. 스킬별 핵심 스크립트</w:t>
       </w:r>
     </w:p>
@@ -896,31 +417,20 @@
       <w:tblPr>
         <w:tblStyle w:val="TableGrid"/>
         <w:tblW w:type="auto" w:w="0"/>
-        <w:tblLayout w:type="fixed"/>
         <w:tblLook w:firstColumn="1" w:firstRow="1" w:lastColumn="0" w:lastRow="0" w:noHBand="0" w:noVBand="1" w:val="04A0"/>
       </w:tblPr>
       <w:tblGrid>
-        <w:gridCol w:w="3120"/>
-        <w:gridCol w:w="3120"/>
-        <w:gridCol w:w="3120"/>
+        <w:gridCol w:w="2880"/>
+        <w:gridCol w:w="2880"/>
+        <w:gridCol w:w="2880"/>
       </w:tblGrid>
       <w:tr>
         <w:tc>
           <w:tcPr>
-            <w:tcW w:type="dxa" w:w="2304"/>
-            <w:shd w:fill="D9EAF7"/>
+            <w:tcW w:type="dxa" w:w="2880"/>
           </w:tcPr>
           <w:p>
-            <w:pPr>
-              <w:jc w:val="center"/>
-            </w:pPr>
-            <w:r/>
             <w:r>
-              <w:rPr>
-                <w:rFonts w:ascii="Arial" w:hAnsi="Arial"/>
-                <w:b/>
-                <w:sz w:val="19"/>
-              </w:rPr>
               <w:t>스킬 문서</w:t>
             </w:r>
           </w:p>
@@ -928,39 +438,19 @@
         <w:tc>
           <w:tcPr>
             <w:tcW w:type="dxa" w:w="2880"/>
-            <w:shd w:fill="D9EAF7"/>
           </w:tcPr>
           <w:p>
-            <w:pPr>
-              <w:jc w:val="center"/>
-            </w:pPr>
-            <w:r/>
             <w:r>
-              <w:rPr>
-                <w:rFonts w:ascii="Arial" w:hAnsi="Arial"/>
-                <w:b/>
-                <w:sz w:val="19"/>
-              </w:rPr>
               <w:t>핵심 스크립트</w:t>
             </w:r>
           </w:p>
         </w:tc>
         <w:tc>
           <w:tcPr>
-            <w:tcW w:type="dxa" w:w="4176"/>
-            <w:shd w:fill="D9EAF7"/>
+            <w:tcW w:type="dxa" w:w="2880"/>
           </w:tcPr>
           <w:p>
-            <w:pPr>
-              <w:jc w:val="center"/>
-            </w:pPr>
-            <w:r/>
             <w:r>
-              <w:rPr>
-                <w:rFonts w:ascii="Arial" w:hAnsi="Arial"/>
-                <w:b/>
-                <w:sz w:val="19"/>
-              </w:rPr>
               <w:t>설명</w:t>
             </w:r>
           </w:p>
@@ -969,19 +459,10 @@
       <w:tr>
         <w:tc>
           <w:tcPr>
-            <w:tcW w:type="dxa" w:w="2304"/>
+            <w:tcW w:type="dxa" w:w="2880"/>
           </w:tcPr>
           <w:p>
-            <w:pPr>
-              <w:jc w:val="left"/>
-            </w:pPr>
-            <w:r/>
             <w:r>
-              <w:rPr>
-                <w:rFonts w:ascii="Arial" w:hAnsi="Arial"/>
-                <w:b w:val="0"/>
-                <w:sz w:val="19"/>
-              </w:rPr>
               <w:t>01-agent-mlflow-skill-project-analyze</w:t>
             </w:r>
           </w:p>
@@ -991,35 +472,17 @@
             <w:tcW w:type="dxa" w:w="2880"/>
           </w:tcPr>
           <w:p>
-            <w:pPr>
-              <w:jc w:val="left"/>
-            </w:pPr>
-            <w:r/>
             <w:r>
-              <w:rPr>
-                <w:rFonts w:ascii="Arial" w:hAnsi="Arial"/>
-                <w:b w:val="0"/>
-                <w:sz w:val="19"/>
-              </w:rPr>
               <w:t>01-project-analyze/validate_mlflow_project.py</w:t>
             </w:r>
           </w:p>
         </w:tc>
         <w:tc>
           <w:tcPr>
-            <w:tcW w:type="dxa" w:w="4176"/>
+            <w:tcW w:type="dxa" w:w="2880"/>
           </w:tcPr>
           <w:p>
-            <w:pPr>
-              <w:jc w:val="left"/>
-            </w:pPr>
-            <w:r/>
             <w:r>
-              <w:rPr>
-                <w:rFonts w:ascii="Arial" w:hAnsi="Arial"/>
-                <w:b w:val="0"/>
-                <w:sz w:val="19"/>
-              </w:rPr>
               <w:t>프로젝트 구조와 모델 존재 여부 분석</w:t>
             </w:r>
           </w:p>
@@ -1028,19 +491,10 @@
       <w:tr>
         <w:tc>
           <w:tcPr>
-            <w:tcW w:type="dxa" w:w="2304"/>
+            <w:tcW w:type="dxa" w:w="2880"/>
           </w:tcPr>
           <w:p>
-            <w:pPr>
-              <w:jc w:val="left"/>
-            </w:pPr>
-            <w:r/>
             <w:r>
-              <w:rPr>
-                <w:rFonts w:ascii="Arial" w:hAnsi="Arial"/>
-                <w:b w:val="0"/>
-                <w:sz w:val="19"/>
-              </w:rPr>
               <w:t>02-agent-mlflow-skill-sample-bootstrap</w:t>
             </w:r>
           </w:p>
@@ -1050,35 +504,17 @@
             <w:tcW w:type="dxa" w:w="2880"/>
           </w:tcPr>
           <w:p>
-            <w:pPr>
-              <w:jc w:val="left"/>
-            </w:pPr>
-            <w:r/>
             <w:r>
-              <w:rPr>
-                <w:rFonts w:ascii="Arial" w:hAnsi="Arial"/>
-                <w:b w:val="0"/>
-                <w:sz w:val="19"/>
-              </w:rPr>
               <w:t>02-sample-bootstrap/bootstrap_sample_project.py</w:t>
             </w:r>
           </w:p>
         </w:tc>
         <w:tc>
           <w:tcPr>
-            <w:tcW w:type="dxa" w:w="4176"/>
+            <w:tcW w:type="dxa" w:w="2880"/>
           </w:tcPr>
           <w:p>
-            <w:pPr>
-              <w:jc w:val="left"/>
-            </w:pPr>
-            <w:r/>
             <w:r>
-              <w:rPr>
-                <w:rFonts w:ascii="Arial" w:hAnsi="Arial"/>
-                <w:b w:val="0"/>
-                <w:sz w:val="19"/>
-              </w:rPr>
               <w:t>샘플/템플릿 복사</w:t>
             </w:r>
           </w:p>
@@ -1087,19 +523,10 @@
       <w:tr>
         <w:tc>
           <w:tcPr>
-            <w:tcW w:type="dxa" w:w="2304"/>
+            <w:tcW w:type="dxa" w:w="2880"/>
           </w:tcPr>
           <w:p>
-            <w:pPr>
-              <w:jc w:val="left"/>
-            </w:pPr>
-            <w:r/>
             <w:r>
-              <w:rPr>
-                <w:rFonts w:ascii="Arial" w:hAnsi="Arial"/>
-                <w:b w:val="0"/>
-                <w:sz w:val="19"/>
-              </w:rPr>
               <w:t>03-agent-mlflow-skill-environment-check</w:t>
             </w:r>
           </w:p>
@@ -1109,35 +536,17 @@
             <w:tcW w:type="dxa" w:w="2880"/>
           </w:tcPr>
           <w:p>
-            <w:pPr>
-              <w:jc w:val="left"/>
-            </w:pPr>
-            <w:r/>
             <w:r>
-              <w:rPr>
-                <w:rFonts w:ascii="Arial" w:hAnsi="Arial"/>
-                <w:b w:val="0"/>
-                <w:sz w:val="19"/>
-              </w:rPr>
               <w:t>03-environment-check/check_environment.py</w:t>
             </w:r>
           </w:p>
         </w:tc>
         <w:tc>
           <w:tcPr>
-            <w:tcW w:type="dxa" w:w="4176"/>
+            <w:tcW w:type="dxa" w:w="2880"/>
           </w:tcPr>
           <w:p>
-            <w:pPr>
-              <w:jc w:val="left"/>
-            </w:pPr>
-            <w:r/>
             <w:r>
-              <w:rPr>
-                <w:rFonts w:ascii="Arial" w:hAnsi="Arial"/>
-                <w:b w:val="0"/>
-                <w:sz w:val="19"/>
-              </w:rPr>
               <w:t>환경변수, 패키지, requirements 점검</w:t>
             </w:r>
           </w:p>
@@ -1146,19 +555,10 @@
       <w:tr>
         <w:tc>
           <w:tcPr>
-            <w:tcW w:type="dxa" w:w="2304"/>
+            <w:tcW w:type="dxa" w:w="2880"/>
           </w:tcPr>
           <w:p>
-            <w:pPr>
-              <w:jc w:val="left"/>
-            </w:pPr>
-            <w:r/>
             <w:r>
-              <w:rPr>
-                <w:rFonts w:ascii="Arial" w:hAnsi="Arial"/>
-                <w:b w:val="0"/>
-                <w:sz w:val="19"/>
-              </w:rPr>
               <w:t>04-agent-mlflow-skill-train-model</w:t>
             </w:r>
           </w:p>
@@ -1168,35 +568,17 @@
             <w:tcW w:type="dxa" w:w="2880"/>
           </w:tcPr>
           <w:p>
-            <w:pPr>
-              <w:jc w:val="left"/>
-            </w:pPr>
-            <w:r/>
             <w:r>
-              <w:rPr>
-                <w:rFonts w:ascii="Arial" w:hAnsi="Arial"/>
-                <w:b w:val="0"/>
-                <w:sz w:val="19"/>
-              </w:rPr>
               <w:t>04-train-model/prepare_selected_model.py</w:t>
             </w:r>
           </w:p>
         </w:tc>
         <w:tc>
           <w:tcPr>
-            <w:tcW w:type="dxa" w:w="4176"/>
+            <w:tcW w:type="dxa" w:w="2880"/>
           </w:tcPr>
           <w:p>
-            <w:pPr>
-              <w:jc w:val="left"/>
-            </w:pPr>
-            <w:r/>
             <w:r>
-              <w:rPr>
-                <w:rFonts w:ascii="Arial" w:hAnsi="Arial"/>
-                <w:b w:val="0"/>
-                <w:sz w:val="19"/>
-              </w:rPr>
               <w:t>모델 선택, runtest_2.py 생성, 템플릿 변환</w:t>
             </w:r>
           </w:p>
@@ -1205,19 +587,10 @@
       <w:tr>
         <w:tc>
           <w:tcPr>
-            <w:tcW w:type="dxa" w:w="2304"/>
+            <w:tcW w:type="dxa" w:w="2880"/>
           </w:tcPr>
           <w:p>
-            <w:pPr>
-              <w:jc w:val="left"/>
-            </w:pPr>
-            <w:r/>
             <w:r>
-              <w:rPr>
-                <w:rFonts w:ascii="Arial" w:hAnsi="Arial"/>
-                <w:b w:val="0"/>
-                <w:sz w:val="19"/>
-              </w:rPr>
               <w:t>05-agent-mlflow-skill-inference-test</w:t>
             </w:r>
           </w:p>
@@ -1227,57 +600,8 @@
             <w:tcW w:type="dxa" w:w="2880"/>
           </w:tcPr>
           <w:p>
-            <w:pPr>
-              <w:jc w:val="left"/>
-            </w:pPr>
-            <w:r/>
             <w:r>
-              <w:rPr>
-                <w:rFonts w:ascii="Arial" w:hAnsi="Arial"/>
-                <w:b w:val="0"/>
-                <w:sz w:val="19"/>
-              </w:rPr>
               <w:t>05-inference-test/test_inference.py</w:t>
-            </w:r>
-          </w:p>
-        </w:tc>
-        <w:tc>
-          <w:tcPr>
-            <w:tcW w:type="dxa" w:w="4176"/>
-          </w:tcPr>
-          <w:p>
-            <w:pPr>
-              <w:jc w:val="left"/>
-            </w:pPr>
-            <w:r/>
-            <w:r>
-              <w:rPr>
-                <w:rFonts w:ascii="Arial" w:hAnsi="Arial"/>
-                <w:b w:val="0"/>
-                <w:sz w:val="19"/>
-              </w:rPr>
-              <w:t>추론 테스트 실행</w:t>
-            </w:r>
-          </w:p>
-        </w:tc>
-      </w:tr>
-      <w:tr>
-        <w:tc>
-          <w:tcPr>
-            <w:tcW w:type="dxa" w:w="2304"/>
-          </w:tcPr>
-          <w:p>
-            <w:pPr>
-              <w:jc w:val="left"/>
-            </w:pPr>
-            <w:r/>
-            <w:r>
-              <w:rPr>
-                <w:rFonts w:ascii="Arial" w:hAnsi="Arial"/>
-                <w:b w:val="0"/>
-                <w:sz w:val="19"/>
-              </w:rPr>
-              <w:t>06-agent-mlflow-skill-mlflow-verify</w:t>
             </w:r>
           </w:p>
         </w:tc>
@@ -1286,53 +610,18 @@
             <w:tcW w:type="dxa" w:w="2880"/>
           </w:tcPr>
           <w:p>
-            <w:pPr>
-              <w:jc w:val="left"/>
-            </w:pPr>
-            <w:r/>
             <w:r>
-              <w:rPr>
-                <w:rFonts w:ascii="Arial" w:hAnsi="Arial"/>
-                <w:b w:val="0"/>
-                <w:sz w:val="19"/>
-              </w:rPr>
-              <w:t>06-mlflow-verify/verify_mlflow.py</w:t>
-            </w:r>
-          </w:p>
-        </w:tc>
-        <w:tc>
-          <w:tcPr>
-            <w:tcW w:type="dxa" w:w="4176"/>
-          </w:tcPr>
-          <w:p>
-            <w:pPr>
-              <w:jc w:val="left"/>
-            </w:pPr>
-            <w:r/>
-            <w:r>
-              <w:rPr>
-                <w:rFonts w:ascii="Arial" w:hAnsi="Arial"/>
-                <w:b w:val="0"/>
-                <w:sz w:val="19"/>
-              </w:rPr>
-              <w:t>MLflow 검증</w:t>
+              <w:t>추론 테스트 실행</w:t>
             </w:r>
           </w:p>
         </w:tc>
       </w:tr>
     </w:tbl>
-    <w:p/>
     <w:p>
       <w:pPr>
-        <w:pStyle w:val="Heading1"/>
-        <w:spacing w:before="200" w:after="120"/>
+        <w:pStyle w:val="Heading2"/>
       </w:pPr>
       <w:r>
-        <w:rPr>
-          <w:rFonts w:ascii="Arial" w:hAnsi="Arial"/>
-          <w:b/>
-          <w:sz w:val="28"/>
-        </w:rPr>
         <w:t>3. 모델 있을 때 스킬 사용 순서</w:t>
       </w:r>
     </w:p>
@@ -1340,92 +629,51 @@
       <w:tblPr>
         <w:tblStyle w:val="TableGrid"/>
         <w:tblW w:type="auto" w:w="0"/>
-        <w:tblLayout w:type="fixed"/>
         <w:tblLook w:firstColumn="1" w:firstRow="1" w:lastColumn="0" w:lastRow="0" w:noHBand="0" w:noVBand="1" w:val="04A0"/>
       </w:tblPr>
       <w:tblGrid>
-        <w:gridCol w:w="2340"/>
-        <w:gridCol w:w="2340"/>
-        <w:gridCol w:w="2340"/>
-        <w:gridCol w:w="2340"/>
+        <w:gridCol w:w="2160"/>
+        <w:gridCol w:w="2160"/>
+        <w:gridCol w:w="2160"/>
+        <w:gridCol w:w="2160"/>
       </w:tblGrid>
       <w:tr>
         <w:tc>
           <w:tcPr>
-            <w:tcW w:type="dxa" w:w="792"/>
-            <w:shd w:fill="D9EAF7"/>
+            <w:tcW w:type="dxa" w:w="2160"/>
           </w:tcPr>
           <w:p>
-            <w:pPr>
-              <w:jc w:val="center"/>
-            </w:pPr>
-            <w:r/>
             <w:r>
-              <w:rPr>
-                <w:rFonts w:ascii="Arial" w:hAnsi="Arial"/>
-                <w:b/>
-                <w:sz w:val="19"/>
-              </w:rPr>
               <w:t>순서</w:t>
             </w:r>
           </w:p>
         </w:tc>
         <w:tc>
           <w:tcPr>
-            <w:tcW w:type="dxa" w:w="2088"/>
-            <w:shd w:fill="D9EAF7"/>
+            <w:tcW w:type="dxa" w:w="2160"/>
           </w:tcPr>
           <w:p>
-            <w:pPr>
-              <w:jc w:val="center"/>
-            </w:pPr>
-            <w:r/>
             <w:r>
-              <w:rPr>
-                <w:rFonts w:ascii="Arial" w:hAnsi="Arial"/>
-                <w:b/>
-                <w:sz w:val="19"/>
-              </w:rPr>
               <w:t>사용하는 스킬</w:t>
             </w:r>
           </w:p>
         </w:tc>
         <w:tc>
           <w:tcPr>
-            <w:tcW w:type="dxa" w:w="2232"/>
-            <w:shd w:fill="D9EAF7"/>
+            <w:tcW w:type="dxa" w:w="2160"/>
           </w:tcPr>
           <w:p>
-            <w:pPr>
-              <w:jc w:val="center"/>
-            </w:pPr>
-            <w:r/>
             <w:r>
-              <w:rPr>
-                <w:rFonts w:ascii="Arial" w:hAnsi="Arial"/>
-                <w:b/>
-                <w:sz w:val="19"/>
-              </w:rPr>
               <w:t>목적</w:t>
             </w:r>
           </w:p>
         </w:tc>
         <w:tc>
           <w:tcPr>
-            <w:tcW w:type="dxa" w:w="4248"/>
-            <w:shd w:fill="D9EAF7"/>
+            <w:tcW w:type="dxa" w:w="2160"/>
           </w:tcPr>
           <w:p>
-            <w:pPr>
-              <w:jc w:val="center"/>
-            </w:pPr>
-            <w:r/>
             <w:r>
-              <w:rPr>
-                <w:rFonts w:ascii="Arial" w:hAnsi="Arial"/>
-                <w:b/>
-                <w:sz w:val="19"/>
-              </w:rPr>
               <w:t>대표 실행</w:t>
             </w:r>
           </w:p>
@@ -1434,76 +682,124 @@
       <w:tr>
         <w:tc>
           <w:tcPr>
-            <w:tcW w:type="dxa" w:w="792"/>
+            <w:tcW w:type="dxa" w:w="2160"/>
           </w:tcPr>
           <w:p>
-            <w:pPr>
-              <w:jc w:val="left"/>
-            </w:pPr>
-            <w:r/>
             <w:r>
-              <w:rPr>
-                <w:rFonts w:ascii="Arial" w:hAnsi="Arial"/>
-                <w:b w:val="0"/>
-                <w:sz w:val="19"/>
-              </w:rPr>
               <w:t>1</w:t>
             </w:r>
           </w:p>
         </w:tc>
         <w:tc>
           <w:tcPr>
-            <w:tcW w:type="dxa" w:w="2088"/>
+            <w:tcW w:type="dxa" w:w="2160"/>
           </w:tcPr>
           <w:p>
-            <w:pPr>
-              <w:jc w:val="left"/>
-            </w:pPr>
-            <w:r/>
             <w:r>
-              <w:rPr>
-                <w:rFonts w:ascii="Arial" w:hAnsi="Arial"/>
-                <w:b w:val="0"/>
-                <w:sz w:val="19"/>
-              </w:rPr>
               <w:t>01-agent-mlflow-skill-project-analyze</w:t>
             </w:r>
           </w:p>
         </w:tc>
         <w:tc>
           <w:tcPr>
-            <w:tcW w:type="dxa" w:w="2232"/>
+            <w:tcW w:type="dxa" w:w="2160"/>
           </w:tcPr>
           <w:p>
-            <w:pPr>
-              <w:jc w:val="left"/>
-            </w:pPr>
-            <w:r/>
             <w:r>
-              <w:rPr>
-                <w:rFonts w:ascii="Arial" w:hAnsi="Arial"/>
-                <w:b w:val="0"/>
-                <w:sz w:val="19"/>
-              </w:rPr>
+              <w:t>워크스페이스 분석</w:t>
+            </w:r>
+          </w:p>
+        </w:tc>
+        <w:tc>
+          <w:tcPr>
+            <w:tcW w:type="dxa" w:w="2160"/>
+          </w:tcPr>
+          <w:p>
+            <w:r>
+              <w:t>프로젝트 분석</w:t>
+            </w:r>
+          </w:p>
+        </w:tc>
+      </w:tr>
+      <w:tr>
+        <w:tc>
+          <w:tcPr>
+            <w:tcW w:type="dxa" w:w="2160"/>
+          </w:tcPr>
+          <w:p>
+            <w:r>
+              <w:t>2</w:t>
+            </w:r>
+          </w:p>
+        </w:tc>
+        <w:tc>
+          <w:tcPr>
+            <w:tcW w:type="dxa" w:w="2160"/>
+          </w:tcPr>
+          <w:p>
+            <w:r>
+              <w:t>01-agent-mlflow-skill-project-analyze</w:t>
+            </w:r>
+          </w:p>
+        </w:tc>
+        <w:tc>
+          <w:tcPr>
+            <w:tcW w:type="dxa" w:w="2160"/>
+          </w:tcPr>
+          <w:p>
+            <w:r>
+              <w:t>모델 있음/없음 확인</w:t>
+            </w:r>
+          </w:p>
+        </w:tc>
+        <w:tc>
+          <w:tcPr>
+            <w:tcW w:type="dxa" w:w="2160"/>
+          </w:tcPr>
+          <w:p>
+            <w:r>
+              <w:t>model_found 확인</w:t>
+            </w:r>
+          </w:p>
+        </w:tc>
+      </w:tr>
+      <w:tr>
+        <w:tc>
+          <w:tcPr>
+            <w:tcW w:type="dxa" w:w="2160"/>
+          </w:tcPr>
+          <w:p>
+            <w:r>
+              <w:t>3</w:t>
+            </w:r>
+          </w:p>
+        </w:tc>
+        <w:tc>
+          <w:tcPr>
+            <w:tcW w:type="dxa" w:w="2160"/>
+          </w:tcPr>
+          <w:p>
+            <w:r>
+              <w:t>01-agent-mlflow-skill-project-analyze</w:t>
+            </w:r>
+          </w:p>
+        </w:tc>
+        <w:tc>
+          <w:tcPr>
+            <w:tcW w:type="dxa" w:w="2160"/>
+          </w:tcPr>
+          <w:p>
+            <w:r>
               <w:t>모델 목록 확인</w:t>
             </w:r>
           </w:p>
         </w:tc>
         <w:tc>
           <w:tcPr>
-            <w:tcW w:type="dxa" w:w="4248"/>
+            <w:tcW w:type="dxa" w:w="2160"/>
           </w:tcPr>
           <w:p>
-            <w:pPr>
-              <w:jc w:val="left"/>
-            </w:pPr>
-            <w:r/>
             <w:r>
-              <w:rPr>
-                <w:rFonts w:ascii="Arial" w:hAnsi="Arial"/>
-                <w:b w:val="0"/>
-                <w:sz w:val="19"/>
-              </w:rPr>
               <w:t>모델 검색/분석</w:t>
             </w:r>
           </w:p>
@@ -1512,76 +808,40 @@
       <w:tr>
         <w:tc>
           <w:tcPr>
-            <w:tcW w:type="dxa" w:w="792"/>
+            <w:tcW w:type="dxa" w:w="2160"/>
           </w:tcPr>
           <w:p>
-            <w:pPr>
-              <w:jc w:val="left"/>
-            </w:pPr>
-            <w:r/>
             <w:r>
-              <w:rPr>
-                <w:rFonts w:ascii="Arial" w:hAnsi="Arial"/>
-                <w:b w:val="0"/>
-                <w:sz w:val="19"/>
-              </w:rPr>
-              <w:t>2</w:t>
+              <w:t>4</w:t>
             </w:r>
           </w:p>
         </w:tc>
         <w:tc>
           <w:tcPr>
-            <w:tcW w:type="dxa" w:w="2088"/>
+            <w:tcW w:type="dxa" w:w="2160"/>
           </w:tcPr>
           <w:p>
-            <w:pPr>
-              <w:jc w:val="left"/>
-            </w:pPr>
-            <w:r/>
             <w:r>
-              <w:rPr>
-                <w:rFonts w:ascii="Arial" w:hAnsi="Arial"/>
-                <w:b w:val="0"/>
-                <w:sz w:val="19"/>
-              </w:rPr>
               <w:t>04-agent-mlflow-skill-train-model</w:t>
             </w:r>
           </w:p>
         </w:tc>
         <w:tc>
           <w:tcPr>
-            <w:tcW w:type="dxa" w:w="2232"/>
+            <w:tcW w:type="dxa" w:w="2160"/>
           </w:tcPr>
           <w:p>
-            <w:pPr>
-              <w:jc w:val="left"/>
-            </w:pPr>
-            <w:r/>
             <w:r>
-              <w:rPr>
-                <w:rFonts w:ascii="Arial" w:hAnsi="Arial"/>
-                <w:b w:val="0"/>
-                <w:sz w:val="19"/>
-              </w:rPr>
               <w:t>모델 선택</w:t>
             </w:r>
           </w:p>
         </w:tc>
         <w:tc>
           <w:tcPr>
-            <w:tcW w:type="dxa" w:w="4248"/>
+            <w:tcW w:type="dxa" w:w="2160"/>
           </w:tcPr>
           <w:p>
-            <w:pPr>
-              <w:jc w:val="left"/>
-            </w:pPr>
-            <w:r/>
             <w:r>
-              <w:rPr>
-                <w:rFonts w:ascii="Arial" w:hAnsi="Arial"/>
-                <w:b w:val="0"/>
-                <w:sz w:val="19"/>
-              </w:rPr>
               <w:t>prepare_selected_model.py --model ... --execute</w:t>
             </w:r>
           </w:p>
@@ -1590,77 +850,41 @@
       <w:tr>
         <w:tc>
           <w:tcPr>
-            <w:tcW w:type="dxa" w:w="792"/>
+            <w:tcW w:type="dxa" w:w="2160"/>
           </w:tcPr>
           <w:p>
-            <w:pPr>
-              <w:jc w:val="left"/>
-            </w:pPr>
-            <w:r/>
             <w:r>
-              <w:rPr>
-                <w:rFonts w:ascii="Arial" w:hAnsi="Arial"/>
-                <w:b w:val="0"/>
-                <w:sz w:val="19"/>
-              </w:rPr>
-              <w:t>3</w:t>
+              <w:t>5</w:t>
             </w:r>
           </w:p>
         </w:tc>
         <w:tc>
           <w:tcPr>
-            <w:tcW w:type="dxa" w:w="2088"/>
+            <w:tcW w:type="dxa" w:w="2160"/>
           </w:tcPr>
           <w:p>
-            <w:pPr>
-              <w:jc w:val="left"/>
-            </w:pPr>
-            <w:r/>
             <w:r>
-              <w:rPr>
-                <w:rFonts w:ascii="Arial" w:hAnsi="Arial"/>
-                <w:b w:val="0"/>
-                <w:sz w:val="19"/>
-              </w:rPr>
               <w:t>04-agent-mlflow-skill-train-model</w:t>
             </w:r>
           </w:p>
         </w:tc>
         <w:tc>
           <w:tcPr>
-            <w:tcW w:type="dxa" w:w="2232"/>
+            <w:tcW w:type="dxa" w:w="2160"/>
           </w:tcPr>
           <w:p>
-            <w:pPr>
-              <w:jc w:val="left"/>
-            </w:pPr>
-            <w:r/>
             <w:r>
-              <w:rPr>
-                <w:rFonts w:ascii="Arial" w:hAnsi="Arial"/>
-                <w:b w:val="0"/>
-                <w:sz w:val="19"/>
-              </w:rPr>
-              <w:t>템플릿 복사 + runtest_2.py 생성 + 템플릿 변환</w:t>
+              <w:t>모델 확인</w:t>
             </w:r>
           </w:p>
         </w:tc>
         <w:tc>
           <w:tcPr>
-            <w:tcW w:type="dxa" w:w="4248"/>
+            <w:tcW w:type="dxa" w:w="2160"/>
           </w:tcPr>
           <w:p>
-            <w:pPr>
-              <w:jc w:val="left"/>
-            </w:pPr>
-            <w:r/>
             <w:r>
-              <w:rPr>
-                <w:rFonts w:ascii="Arial" w:hAnsi="Arial"/>
-                <w:b w:val="0"/>
-                <w:sz w:val="19"/>
-              </w:rPr>
-              <w:t>prepare_selected_model.py --sync-runtime --execute</w:t>
+              <w:t>선택 모델 경로와 MODEL_KIND 확인</w:t>
             </w:r>
           </w:p>
         </w:tc>
@@ -1668,76 +892,166 @@
       <w:tr>
         <w:tc>
           <w:tcPr>
-            <w:tcW w:type="dxa" w:w="792"/>
+            <w:tcW w:type="dxa" w:w="2160"/>
           </w:tcPr>
           <w:p>
-            <w:pPr>
-              <w:jc w:val="left"/>
-            </w:pPr>
-            <w:r/>
             <w:r>
-              <w:rPr>
-                <w:rFonts w:ascii="Arial" w:hAnsi="Arial"/>
-                <w:b w:val="0"/>
-                <w:sz w:val="19"/>
-              </w:rPr>
-              <w:t>4</w:t>
+              <w:t>6</w:t>
             </w:r>
           </w:p>
         </w:tc>
         <w:tc>
           <w:tcPr>
-            <w:tcW w:type="dxa" w:w="2088"/>
+            <w:tcW w:type="dxa" w:w="2160"/>
           </w:tcPr>
           <w:p>
-            <w:pPr>
-              <w:jc w:val="left"/>
-            </w:pPr>
-            <w:r/>
             <w:r>
-              <w:rPr>
-                <w:rFonts w:ascii="Arial" w:hAnsi="Arial"/>
-                <w:b w:val="0"/>
-                <w:sz w:val="19"/>
-              </w:rPr>
+              <w:t>04-agent-mlflow-skill-train-model</w:t>
+            </w:r>
+          </w:p>
+        </w:tc>
+        <w:tc>
+          <w:tcPr>
+            <w:tcW w:type="dxa" w:w="2160"/>
+          </w:tcPr>
+          <w:p>
+            <w:r>
+              <w:t>폴더 복사</w:t>
+            </w:r>
+          </w:p>
+        </w:tc>
+        <w:tc>
+          <w:tcPr>
+            <w:tcW w:type="dxa" w:w="2160"/>
+          </w:tcPr>
+          <w:p>
+            <w:r>
+              <w:t>prepare_selected_model.py --model ... --execute</w:t>
+            </w:r>
+          </w:p>
+        </w:tc>
+      </w:tr>
+      <w:tr>
+        <w:tc>
+          <w:tcPr>
+            <w:tcW w:type="dxa" w:w="2160"/>
+          </w:tcPr>
+          <w:p>
+            <w:r>
+              <w:t>7</w:t>
+            </w:r>
+          </w:p>
+        </w:tc>
+        <w:tc>
+          <w:tcPr>
+            <w:tcW w:type="dxa" w:w="2160"/>
+          </w:tcPr>
+          <w:p>
+            <w:r>
+              <w:t>04-agent-mlflow-skill-train-model</w:t>
+            </w:r>
+          </w:p>
+        </w:tc>
+        <w:tc>
+          <w:tcPr>
+            <w:tcW w:type="dxa" w:w="2160"/>
+          </w:tcPr>
+          <w:p>
+            <w:r>
+              <w:t>runtest_2.py 생성</w:t>
+            </w:r>
+          </w:p>
+        </w:tc>
+        <w:tc>
+          <w:tcPr>
+            <w:tcW w:type="dxa" w:w="2160"/>
+          </w:tcPr>
+          <w:p>
+            <w:r>
+              <w:t>prepare_selected_model.py --model ... --execute</w:t>
+            </w:r>
+          </w:p>
+        </w:tc>
+      </w:tr>
+      <w:tr>
+        <w:tc>
+          <w:tcPr>
+            <w:tcW w:type="dxa" w:w="2160"/>
+          </w:tcPr>
+          <w:p>
+            <w:r>
+              <w:t>8</w:t>
+            </w:r>
+          </w:p>
+        </w:tc>
+        <w:tc>
+          <w:tcPr>
+            <w:tcW w:type="dxa" w:w="2160"/>
+          </w:tcPr>
+          <w:p>
+            <w:r>
+              <w:t>04-agent-mlflow-skill-train-model</w:t>
+            </w:r>
+          </w:p>
+        </w:tc>
+        <w:tc>
+          <w:tcPr>
+            <w:tcW w:type="dxa" w:w="2160"/>
+          </w:tcPr>
+          <w:p>
+            <w:r>
+              <w:t>선택 모델 기준 템플릿 변환</w:t>
+            </w:r>
+          </w:p>
+        </w:tc>
+        <w:tc>
+          <w:tcPr>
+            <w:tcW w:type="dxa" w:w="2160"/>
+          </w:tcPr>
+          <w:p>
+            <w:r>
+              <w:t>prepare_selected_model.py --model ... --execute</w:t>
+            </w:r>
+          </w:p>
+        </w:tc>
+      </w:tr>
+      <w:tr>
+        <w:tc>
+          <w:tcPr>
+            <w:tcW w:type="dxa" w:w="2160"/>
+          </w:tcPr>
+          <w:p>
+            <w:r>
+              <w:t>9</w:t>
+            </w:r>
+          </w:p>
+        </w:tc>
+        <w:tc>
+          <w:tcPr>
+            <w:tcW w:type="dxa" w:w="2160"/>
+          </w:tcPr>
+          <w:p>
+            <w:r>
               <w:t>03-agent-mlflow-skill-environment-check</w:t>
             </w:r>
           </w:p>
         </w:tc>
         <w:tc>
           <w:tcPr>
-            <w:tcW w:type="dxa" w:w="2232"/>
+            <w:tcW w:type="dxa" w:w="2160"/>
           </w:tcPr>
           <w:p>
-            <w:pPr>
-              <w:jc w:val="left"/>
-            </w:pPr>
-            <w:r/>
             <w:r>
-              <w:rPr>
-                <w:rFonts w:ascii="Arial" w:hAnsi="Arial"/>
-                <w:b w:val="0"/>
-                <w:sz w:val="19"/>
-              </w:rPr>
               <w:t>환경 점검</w:t>
             </w:r>
           </w:p>
         </w:tc>
         <w:tc>
           <w:tcPr>
-            <w:tcW w:type="dxa" w:w="4248"/>
+            <w:tcW w:type="dxa" w:w="2160"/>
           </w:tcPr>
           <w:p>
-            <w:pPr>
-              <w:jc w:val="left"/>
-            </w:pPr>
-            <w:r/>
             <w:r>
-              <w:rPr>
-                <w:rFonts w:ascii="Arial" w:hAnsi="Arial"/>
-                <w:b w:val="0"/>
-                <w:sz w:val="19"/>
-              </w:rPr>
               <w:t>check_environment.py --entrypoint runtest_2.py</w:t>
             </w:r>
           </w:p>
@@ -1746,76 +1060,40 @@
       <w:tr>
         <w:tc>
           <w:tcPr>
-            <w:tcW w:type="dxa" w:w="792"/>
+            <w:tcW w:type="dxa" w:w="2160"/>
           </w:tcPr>
           <w:p>
-            <w:pPr>
-              <w:jc w:val="left"/>
-            </w:pPr>
-            <w:r/>
             <w:r>
-              <w:rPr>
-                <w:rFonts w:ascii="Arial" w:hAnsi="Arial"/>
-                <w:b w:val="0"/>
-                <w:sz w:val="19"/>
-              </w:rPr>
-              <w:t>5</w:t>
+              <w:t>10</w:t>
             </w:r>
           </w:p>
         </w:tc>
         <w:tc>
           <w:tcPr>
-            <w:tcW w:type="dxa" w:w="2088"/>
+            <w:tcW w:type="dxa" w:w="2160"/>
           </w:tcPr>
           <w:p>
-            <w:pPr>
-              <w:jc w:val="left"/>
-            </w:pPr>
-            <w:r/>
             <w:r>
-              <w:rPr>
-                <w:rFonts w:ascii="Arial" w:hAnsi="Arial"/>
-                <w:b w:val="0"/>
-                <w:sz w:val="19"/>
-              </w:rPr>
               <w:t>04-agent-mlflow-skill-train-model</w:t>
             </w:r>
           </w:p>
         </w:tc>
         <w:tc>
           <w:tcPr>
-            <w:tcW w:type="dxa" w:w="2232"/>
+            <w:tcW w:type="dxa" w:w="2160"/>
           </w:tcPr>
           <w:p>
-            <w:pPr>
-              <w:jc w:val="left"/>
-            </w:pPr>
-            <w:r/>
             <w:r>
-              <w:rPr>
-                <w:rFonts w:ascii="Arial" w:hAnsi="Arial"/>
-                <w:b w:val="0"/>
-                <w:sz w:val="19"/>
-              </w:rPr>
               <w:t>MLflow 등록 실행</w:t>
             </w:r>
           </w:p>
         </w:tc>
         <w:tc>
           <w:tcPr>
-            <w:tcW w:type="dxa" w:w="4248"/>
+            <w:tcW w:type="dxa" w:w="2160"/>
           </w:tcPr>
           <w:p>
-            <w:pPr>
-              <w:jc w:val="left"/>
-            </w:pPr>
-            <w:r/>
             <w:r>
-              <w:rPr>
-                <w:rFonts w:ascii="Arial" w:hAnsi="Arial"/>
-                <w:b w:val="0"/>
-                <w:sz w:val="19"/>
-              </w:rPr>
               <w:t>python runtest_2.py</w:t>
             </w:r>
           </w:p>
@@ -1824,76 +1102,40 @@
       <w:tr>
         <w:tc>
           <w:tcPr>
-            <w:tcW w:type="dxa" w:w="792"/>
+            <w:tcW w:type="dxa" w:w="2160"/>
           </w:tcPr>
           <w:p>
-            <w:pPr>
-              <w:jc w:val="left"/>
-            </w:pPr>
-            <w:r/>
             <w:r>
-              <w:rPr>
-                <w:rFonts w:ascii="Arial" w:hAnsi="Arial"/>
-                <w:b w:val="0"/>
-                <w:sz w:val="19"/>
-              </w:rPr>
-              <w:t>6</w:t>
+              <w:t>11</w:t>
             </w:r>
           </w:p>
         </w:tc>
         <w:tc>
           <w:tcPr>
-            <w:tcW w:type="dxa" w:w="2088"/>
+            <w:tcW w:type="dxa" w:w="2160"/>
           </w:tcPr>
           <w:p>
-            <w:pPr>
-              <w:jc w:val="left"/>
-            </w:pPr>
-            <w:r/>
             <w:r>
-              <w:rPr>
-                <w:rFonts w:ascii="Arial" w:hAnsi="Arial"/>
-                <w:b w:val="0"/>
-                <w:sz w:val="19"/>
-              </w:rPr>
               <w:t>05-agent-mlflow-skill-inference-test</w:t>
             </w:r>
           </w:p>
         </w:tc>
         <w:tc>
           <w:tcPr>
-            <w:tcW w:type="dxa" w:w="2232"/>
+            <w:tcW w:type="dxa" w:w="2160"/>
           </w:tcPr>
           <w:p>
-            <w:pPr>
-              <w:jc w:val="left"/>
-            </w:pPr>
-            <w:r/>
             <w:r>
-              <w:rPr>
-                <w:rFonts w:ascii="Arial" w:hAnsi="Arial"/>
-                <w:b w:val="0"/>
-                <w:sz w:val="19"/>
-              </w:rPr>
               <w:t>추론 테스트</w:t>
             </w:r>
           </w:p>
         </w:tc>
         <w:tc>
           <w:tcPr>
-            <w:tcW w:type="dxa" w:w="4248"/>
+            <w:tcW w:type="dxa" w:w="2160"/>
           </w:tcPr>
           <w:p>
-            <w:pPr>
-              <w:jc w:val="left"/>
-            </w:pPr>
-            <w:r/>
             <w:r>
-              <w:rPr>
-                <w:rFonts w:ascii="Arial" w:hAnsi="Arial"/>
-                <w:b w:val="0"/>
-                <w:sz w:val="19"/>
-              </w:rPr>
               <w:t>python local_serving/localservingtest.py</w:t>
             </w:r>
           </w:p>
@@ -1902,94 +1144,51 @@
       <w:tr>
         <w:tc>
           <w:tcPr>
-            <w:tcW w:type="dxa" w:w="792"/>
+            <w:tcW w:type="dxa" w:w="2160"/>
           </w:tcPr>
           <w:p>
-            <w:pPr>
-              <w:jc w:val="left"/>
-            </w:pPr>
-            <w:r/>
             <w:r>
-              <w:rPr>
-                <w:rFonts w:ascii="Arial" w:hAnsi="Arial"/>
-                <w:b w:val="0"/>
-                <w:sz w:val="19"/>
-              </w:rPr>
-              <w:t>7</w:t>
+              <w:t>12</w:t>
             </w:r>
           </w:p>
         </w:tc>
         <w:tc>
           <w:tcPr>
-            <w:tcW w:type="dxa" w:w="2088"/>
+            <w:tcW w:type="dxa" w:w="2160"/>
           </w:tcPr>
           <w:p>
-            <w:pPr>
-              <w:jc w:val="left"/>
-            </w:pPr>
-            <w:r/>
             <w:r>
-              <w:rPr>
-                <w:rFonts w:ascii="Arial" w:hAnsi="Arial"/>
-                <w:b w:val="0"/>
-                <w:sz w:val="19"/>
-              </w:rPr>
-              <w:t>06-agent-mlflow-skill-mlflow-verify</w:t>
+              <w:t>실패한 단계의 스킬</w:t>
             </w:r>
           </w:p>
         </w:tc>
         <w:tc>
           <w:tcPr>
-            <w:tcW w:type="dxa" w:w="2232"/>
+            <w:tcW w:type="dxa" w:w="2160"/>
           </w:tcPr>
           <w:p>
-            <w:pPr>
-              <w:jc w:val="left"/>
-            </w:pPr>
-            <w:r/>
             <w:r>
-              <w:rPr>
-                <w:rFonts w:ascii="Arial" w:hAnsi="Arial"/>
-                <w:b w:val="0"/>
-                <w:sz w:val="19"/>
-              </w:rPr>
-              <w:t>MLflow 결과 확인이 필요할 때만 검증</w:t>
+              <w:t>오류 시 실패 단계부터 재실행</w:t>
             </w:r>
           </w:p>
         </w:tc>
         <w:tc>
           <w:tcPr>
-            <w:tcW w:type="dxa" w:w="4248"/>
+            <w:tcW w:type="dxa" w:w="2160"/>
           </w:tcPr>
           <w:p>
-            <w:pPr>
-              <w:jc w:val="left"/>
-            </w:pPr>
-            <w:r/>
             <w:r>
-              <w:rPr>
-                <w:rFonts w:ascii="Arial" w:hAnsi="Arial"/>
-                <w:b w:val="0"/>
-                <w:sz w:val="19"/>
-              </w:rPr>
-              <w:t>verify_mlflow.py ...</w:t>
+              <w:t>Failures 기준으로 재실행</w:t>
             </w:r>
           </w:p>
         </w:tc>
       </w:tr>
     </w:tbl>
-    <w:p/>
     <w:p>
       <w:pPr>
-        <w:pStyle w:val="Heading1"/>
-        <w:spacing w:before="200" w:after="120"/>
+        <w:pStyle w:val="Heading2"/>
       </w:pPr>
       <w:r>
-        <w:rPr>
-          <w:rFonts w:ascii="Arial" w:hAnsi="Arial"/>
-          <w:b/>
-          <w:sz w:val="28"/>
-        </w:rPr>
         <w:t>4. 사용자 입장에서 보는 간략 설명</w:t>
       </w:r>
     </w:p>
@@ -1997,50 +1196,29 @@
       <w:tblPr>
         <w:tblStyle w:val="TableGrid"/>
         <w:tblW w:type="auto" w:w="0"/>
-        <w:tblLayout w:type="fixed"/>
         <w:tblLook w:firstColumn="1" w:firstRow="1" w:lastColumn="0" w:lastRow="0" w:noHBand="0" w:noVBand="1" w:val="04A0"/>
       </w:tblPr>
       <w:tblGrid>
-        <w:gridCol w:w="4680"/>
-        <w:gridCol w:w="4680"/>
+        <w:gridCol w:w="4320"/>
+        <w:gridCol w:w="4320"/>
       </w:tblGrid>
       <w:tr>
         <w:tc>
           <w:tcPr>
-            <w:tcW w:type="dxa" w:w="2448"/>
-            <w:shd w:fill="D9EAF7"/>
+            <w:tcW w:type="dxa" w:w="4320"/>
           </w:tcPr>
           <w:p>
-            <w:pPr>
-              <w:jc w:val="center"/>
-            </w:pPr>
-            <w:r/>
             <w:r>
-              <w:rPr>
-                <w:rFonts w:ascii="Arial" w:hAnsi="Arial"/>
-                <w:b/>
-                <w:sz w:val="19"/>
-              </w:rPr>
               <w:t>단계</w:t>
             </w:r>
           </w:p>
         </w:tc>
         <w:tc>
           <w:tcPr>
-            <w:tcW w:type="dxa" w:w="6912"/>
-            <w:shd w:fill="D9EAF7"/>
+            <w:tcW w:type="dxa" w:w="4320"/>
           </w:tcPr>
           <w:p>
-            <w:pPr>
-              <w:jc w:val="center"/>
-            </w:pPr>
-            <w:r/>
             <w:r>
-              <w:rPr>
-                <w:rFonts w:ascii="Arial" w:hAnsi="Arial"/>
-                <w:b/>
-                <w:sz w:val="19"/>
-              </w:rPr>
               <w:t>사용자 관점 설명</w:t>
             </w:r>
           </w:p>
@@ -2049,39 +1227,21 @@
       <w:tr>
         <w:tc>
           <w:tcPr>
-            <w:tcW w:type="dxa" w:w="2448"/>
+            <w:tcW w:type="dxa" w:w="4320"/>
           </w:tcPr>
           <w:p>
-            <w:pPr>
-              <w:jc w:val="left"/>
-            </w:pPr>
-            <w:r/>
             <w:r>
-              <w:rPr>
-                <w:rFonts w:ascii="Arial" w:hAnsi="Arial"/>
-                <w:b w:val="0"/>
-                <w:sz w:val="19"/>
-              </w:rPr>
               <w:t>1</w:t>
             </w:r>
           </w:p>
         </w:tc>
         <w:tc>
           <w:tcPr>
-            <w:tcW w:type="dxa" w:w="6912"/>
+            <w:tcW w:type="dxa" w:w="4320"/>
           </w:tcPr>
           <w:p>
-            <w:pPr>
-              <w:jc w:val="left"/>
-            </w:pPr>
-            <w:r/>
             <w:r>
-              <w:rPr>
-                <w:rFonts w:ascii="Arial" w:hAnsi="Arial"/>
-                <w:b w:val="0"/>
-                <w:sz w:val="19"/>
-              </w:rPr>
-              <w:t>모델이 있는지 먼저 확인</w:t>
+              <w:t>워크스페이스를 분석</w:t>
             </w:r>
           </w:p>
         </w:tc>
@@ -2089,38 +1249,64 @@
       <w:tr>
         <w:tc>
           <w:tcPr>
-            <w:tcW w:type="dxa" w:w="2448"/>
+            <w:tcW w:type="dxa" w:w="4320"/>
           </w:tcPr>
           <w:p>
-            <w:pPr>
-              <w:jc w:val="left"/>
-            </w:pPr>
-            <w:r/>
             <w:r>
-              <w:rPr>
-                <w:rFonts w:ascii="Arial" w:hAnsi="Arial"/>
-                <w:b w:val="0"/>
-                <w:sz w:val="19"/>
-              </w:rPr>
               <w:t>2</w:t>
             </w:r>
           </w:p>
         </w:tc>
         <w:tc>
           <w:tcPr>
-            <w:tcW w:type="dxa" w:w="6912"/>
+            <w:tcW w:type="dxa" w:w="4320"/>
           </w:tcPr>
           <w:p>
-            <w:pPr>
-              <w:jc w:val="left"/>
-            </w:pPr>
-            <w:r/>
             <w:r>
-              <w:rPr>
-                <w:rFonts w:ascii="Arial" w:hAnsi="Arial"/>
-                <w:b w:val="0"/>
-                <w:sz w:val="19"/>
-              </w:rPr>
+              <w:t>모델 있음/없음을 확인</w:t>
+            </w:r>
+          </w:p>
+        </w:tc>
+      </w:tr>
+      <w:tr>
+        <w:tc>
+          <w:tcPr>
+            <w:tcW w:type="dxa" w:w="4320"/>
+          </w:tcPr>
+          <w:p>
+            <w:r>
+              <w:t>3</w:t>
+            </w:r>
+          </w:p>
+        </w:tc>
+        <w:tc>
+          <w:tcPr>
+            <w:tcW w:type="dxa" w:w="4320"/>
+          </w:tcPr>
+          <w:p>
+            <w:r>
+              <w:t>모델 목록을 확인</w:t>
+            </w:r>
+          </w:p>
+        </w:tc>
+      </w:tr>
+      <w:tr>
+        <w:tc>
+          <w:tcPr>
+            <w:tcW w:type="dxa" w:w="4320"/>
+          </w:tcPr>
+          <w:p>
+            <w:r>
+              <w:t>4</w:t>
+            </w:r>
+          </w:p>
+        </w:tc>
+        <w:tc>
+          <w:tcPr>
+            <w:tcW w:type="dxa" w:w="4320"/>
+          </w:tcPr>
+          <w:p>
+            <w:r>
               <w:t>사용할 모델을 선택</w:t>
             </w:r>
           </w:p>
@@ -2129,39 +1315,21 @@
       <w:tr>
         <w:tc>
           <w:tcPr>
-            <w:tcW w:type="dxa" w:w="2448"/>
+            <w:tcW w:type="dxa" w:w="4320"/>
           </w:tcPr>
           <w:p>
-            <w:pPr>
-              <w:jc w:val="left"/>
-            </w:pPr>
-            <w:r/>
             <w:r>
-              <w:rPr>
-                <w:rFonts w:ascii="Arial" w:hAnsi="Arial"/>
-                <w:b w:val="0"/>
-                <w:sz w:val="19"/>
-              </w:rPr>
-              <w:t>3</w:t>
+              <w:t>5</w:t>
             </w:r>
           </w:p>
         </w:tc>
         <w:tc>
           <w:tcPr>
-            <w:tcW w:type="dxa" w:w="6912"/>
+            <w:tcW w:type="dxa" w:w="4320"/>
           </w:tcPr>
           <w:p>
-            <w:pPr>
-              <w:jc w:val="left"/>
-            </w:pPr>
-            <w:r/>
             <w:r>
-              <w:rPr>
-                <w:rFonts w:ascii="Arial" w:hAnsi="Arial"/>
-                <w:b w:val="0"/>
-                <w:sz w:val="19"/>
-              </w:rPr>
-              <w:t>템플릿을 현재 워크스페이스 루트로 복사</w:t>
+              <w:t>선택한 모델 경로와 형식을 확인</w:t>
             </w:r>
           </w:p>
         </w:tc>
@@ -2169,38 +1337,42 @@
       <w:tr>
         <w:tc>
           <w:tcPr>
-            <w:tcW w:type="dxa" w:w="2448"/>
+            <w:tcW w:type="dxa" w:w="4320"/>
           </w:tcPr>
           <w:p>
-            <w:pPr>
-              <w:jc w:val="left"/>
-            </w:pPr>
-            <w:r/>
             <w:r>
-              <w:rPr>
-                <w:rFonts w:ascii="Arial" w:hAnsi="Arial"/>
-                <w:b w:val="0"/>
-                <w:sz w:val="19"/>
-              </w:rPr>
-              <w:t>4</w:t>
+              <w:t>6</w:t>
             </w:r>
           </w:p>
         </w:tc>
         <w:tc>
           <w:tcPr>
-            <w:tcW w:type="dxa" w:w="6912"/>
+            <w:tcW w:type="dxa" w:w="4320"/>
           </w:tcPr>
           <w:p>
-            <w:pPr>
-              <w:jc w:val="left"/>
-            </w:pPr>
-            <w:r/>
             <w:r>
-              <w:rPr>
-                <w:rFonts w:ascii="Arial" w:hAnsi="Arial"/>
-                <w:b w:val="0"/>
-                <w:sz w:val="19"/>
-              </w:rPr>
+              <w:t>템플릿 폴더를 현재 워크스페이스 루트로 복사</w:t>
+            </w:r>
+          </w:p>
+        </w:tc>
+      </w:tr>
+      <w:tr>
+        <w:tc>
+          <w:tcPr>
+            <w:tcW w:type="dxa" w:w="4320"/>
+          </w:tcPr>
+          <w:p>
+            <w:r>
+              <w:t>7</w:t>
+            </w:r>
+          </w:p>
+        </w:tc>
+        <w:tc>
+          <w:tcPr>
+            <w:tcW w:type="dxa" w:w="4320"/>
+          </w:tcPr>
+          <w:p>
+            <w:r>
               <w:t>runtest.py를 참조해서 runtest_2.py 생성</w:t>
             </w:r>
           </w:p>
@@ -2209,38 +1381,20 @@
       <w:tr>
         <w:tc>
           <w:tcPr>
-            <w:tcW w:type="dxa" w:w="2448"/>
+            <w:tcW w:type="dxa" w:w="4320"/>
           </w:tcPr>
           <w:p>
-            <w:pPr>
-              <w:jc w:val="left"/>
-            </w:pPr>
-            <w:r/>
             <w:r>
-              <w:rPr>
-                <w:rFonts w:ascii="Arial" w:hAnsi="Arial"/>
-                <w:b w:val="0"/>
-                <w:sz w:val="19"/>
-              </w:rPr>
-              <w:t>5</w:t>
+              <w:t>8</w:t>
             </w:r>
           </w:p>
         </w:tc>
         <w:tc>
           <w:tcPr>
-            <w:tcW w:type="dxa" w:w="6912"/>
+            <w:tcW w:type="dxa" w:w="4320"/>
           </w:tcPr>
           <w:p>
-            <w:pPr>
-              <w:jc w:val="left"/>
-            </w:pPr>
-            <w:r/>
             <w:r>
-              <w:rPr>
-                <w:rFonts w:ascii="Arial" w:hAnsi="Arial"/>
-                <w:b w:val="0"/>
-                <w:sz w:val="19"/>
-              </w:rPr>
               <w:t>선택 모델 기준으로 템플릿 변환</w:t>
             </w:r>
           </w:p>
@@ -2249,38 +1403,20 @@
       <w:tr>
         <w:tc>
           <w:tcPr>
-            <w:tcW w:type="dxa" w:w="2448"/>
+            <w:tcW w:type="dxa" w:w="4320"/>
           </w:tcPr>
           <w:p>
-            <w:pPr>
-              <w:jc w:val="left"/>
-            </w:pPr>
-            <w:r/>
             <w:r>
-              <w:rPr>
-                <w:rFonts w:ascii="Arial" w:hAnsi="Arial"/>
-                <w:b w:val="0"/>
-                <w:sz w:val="19"/>
-              </w:rPr>
-              <w:t>6</w:t>
+              <w:t>9</w:t>
             </w:r>
           </w:p>
         </w:tc>
         <w:tc>
           <w:tcPr>
-            <w:tcW w:type="dxa" w:w="6912"/>
+            <w:tcW w:type="dxa" w:w="4320"/>
           </w:tcPr>
           <w:p>
-            <w:pPr>
-              <w:jc w:val="left"/>
-            </w:pPr>
-            <w:r/>
             <w:r>
-              <w:rPr>
-                <w:rFonts w:ascii="Arial" w:hAnsi="Arial"/>
-                <w:b w:val="0"/>
-                <w:sz w:val="19"/>
-              </w:rPr>
               <w:t>환경 점검</w:t>
             </w:r>
           </w:p>
@@ -2289,38 +1425,20 @@
       <w:tr>
         <w:tc>
           <w:tcPr>
-            <w:tcW w:type="dxa" w:w="2448"/>
+            <w:tcW w:type="dxa" w:w="4320"/>
           </w:tcPr>
           <w:p>
-            <w:pPr>
-              <w:jc w:val="left"/>
-            </w:pPr>
-            <w:r/>
             <w:r>
-              <w:rPr>
-                <w:rFonts w:ascii="Arial" w:hAnsi="Arial"/>
-                <w:b w:val="0"/>
-                <w:sz w:val="19"/>
-              </w:rPr>
-              <w:t>7</w:t>
+              <w:t>10</w:t>
             </w:r>
           </w:p>
         </w:tc>
         <w:tc>
           <w:tcPr>
-            <w:tcW w:type="dxa" w:w="6912"/>
+            <w:tcW w:type="dxa" w:w="4320"/>
           </w:tcPr>
           <w:p>
-            <w:pPr>
-              <w:jc w:val="left"/>
-            </w:pPr>
-            <w:r/>
             <w:r>
-              <w:rPr>
-                <w:rFonts w:ascii="Arial" w:hAnsi="Arial"/>
-                <w:b w:val="0"/>
-                <w:sz w:val="19"/>
-              </w:rPr>
               <w:t>MLflow 등록 실행</w:t>
             </w:r>
           </w:p>
@@ -2329,38 +1447,20 @@
       <w:tr>
         <w:tc>
           <w:tcPr>
-            <w:tcW w:type="dxa" w:w="2448"/>
+            <w:tcW w:type="dxa" w:w="4320"/>
           </w:tcPr>
           <w:p>
-            <w:pPr>
-              <w:jc w:val="left"/>
-            </w:pPr>
-            <w:r/>
             <w:r>
-              <w:rPr>
-                <w:rFonts w:ascii="Arial" w:hAnsi="Arial"/>
-                <w:b w:val="0"/>
-                <w:sz w:val="19"/>
-              </w:rPr>
-              <w:t>8</w:t>
+              <w:t>11</w:t>
             </w:r>
           </w:p>
         </w:tc>
         <w:tc>
           <w:tcPr>
-            <w:tcW w:type="dxa" w:w="6912"/>
+            <w:tcW w:type="dxa" w:w="4320"/>
           </w:tcPr>
           <w:p>
-            <w:pPr>
-              <w:jc w:val="left"/>
-            </w:pPr>
-            <w:r/>
             <w:r>
-              <w:rPr>
-                <w:rFonts w:ascii="Arial" w:hAnsi="Arial"/>
-                <w:b w:val="0"/>
-                <w:sz w:val="19"/>
-              </w:rPr>
               <w:t>추론 테스트</w:t>
             </w:r>
           </w:p>
@@ -2369,56 +1469,31 @@
       <w:tr>
         <w:tc>
           <w:tcPr>
-            <w:tcW w:type="dxa" w:w="2448"/>
+            <w:tcW w:type="dxa" w:w="4320"/>
           </w:tcPr>
           <w:p>
-            <w:pPr>
-              <w:jc w:val="left"/>
-            </w:pPr>
-            <w:r/>
             <w:r>
-              <w:rPr>
-                <w:rFonts w:ascii="Arial" w:hAnsi="Arial"/>
-                <w:b w:val="0"/>
-                <w:sz w:val="19"/>
-              </w:rPr>
-              <w:t>9</w:t>
+              <w:t>12</w:t>
             </w:r>
           </w:p>
         </w:tc>
         <w:tc>
           <w:tcPr>
-            <w:tcW w:type="dxa" w:w="6912"/>
+            <w:tcW w:type="dxa" w:w="4320"/>
           </w:tcPr>
           <w:p>
-            <w:pPr>
-              <w:jc w:val="left"/>
-            </w:pPr>
-            <w:r/>
             <w:r>
-              <w:rPr>
-                <w:rFonts w:ascii="Arial" w:hAnsi="Arial"/>
-                <w:b w:val="0"/>
-                <w:sz w:val="19"/>
-              </w:rPr>
               <w:t>오류가 있으면 실패한 단계부터 다시 실행</w:t>
             </w:r>
           </w:p>
         </w:tc>
       </w:tr>
     </w:tbl>
-    <w:p/>
     <w:p>
       <w:pPr>
-        <w:pStyle w:val="Heading1"/>
-        <w:spacing w:before="200" w:after="120"/>
+        <w:pStyle w:val="Heading2"/>
       </w:pPr>
       <w:r>
-        <w:rPr>
-          <w:rFonts w:ascii="Arial" w:hAnsi="Arial"/>
-          <w:b/>
-          <w:sz w:val="28"/>
-        </w:rPr>
         <w:t>5. 핵심 차이</w:t>
       </w:r>
     </w:p>
@@ -2426,50 +1501,29 @@
       <w:tblPr>
         <w:tblStyle w:val="TableGrid"/>
         <w:tblW w:type="auto" w:w="0"/>
-        <w:tblLayout w:type="fixed"/>
         <w:tblLook w:firstColumn="1" w:firstRow="1" w:lastColumn="0" w:lastRow="0" w:noHBand="0" w:noVBand="1" w:val="04A0"/>
       </w:tblPr>
       <w:tblGrid>
-        <w:gridCol w:w="4680"/>
-        <w:gridCol w:w="4680"/>
+        <w:gridCol w:w="4320"/>
+        <w:gridCol w:w="4320"/>
       </w:tblGrid>
       <w:tr>
         <w:tc>
           <w:tcPr>
-            <w:tcW w:type="dxa" w:w="2448"/>
-            <w:shd w:fill="D9EAF7"/>
+            <w:tcW w:type="dxa" w:w="4320"/>
           </w:tcPr>
           <w:p>
-            <w:pPr>
-              <w:jc w:val="center"/>
-            </w:pPr>
-            <w:r/>
             <w:r>
-              <w:rPr>
-                <w:rFonts w:ascii="Arial" w:hAnsi="Arial"/>
-                <w:b/>
-                <w:sz w:val="19"/>
-              </w:rPr>
               <w:t>항목</w:t>
             </w:r>
           </w:p>
         </w:tc>
         <w:tc>
           <w:tcPr>
-            <w:tcW w:type="dxa" w:w="6912"/>
-            <w:shd w:fill="D9EAF7"/>
+            <w:tcW w:type="dxa" w:w="4320"/>
           </w:tcPr>
           <w:p>
-            <w:pPr>
-              <w:jc w:val="center"/>
-            </w:pPr>
-            <w:r/>
             <w:r>
-              <w:rPr>
-                <w:rFonts w:ascii="Arial" w:hAnsi="Arial"/>
-                <w:b/>
-                <w:sz w:val="19"/>
-              </w:rPr>
               <w:t>설명</w:t>
             </w:r>
           </w:p>
@@ -2478,38 +1532,20 @@
       <w:tr>
         <w:tc>
           <w:tcPr>
-            <w:tcW w:type="dxa" w:w="2448"/>
+            <w:tcW w:type="dxa" w:w="4320"/>
           </w:tcPr>
           <w:p>
-            <w:pPr>
-              <w:jc w:val="left"/>
-            </w:pPr>
-            <w:r/>
             <w:r>
-              <w:rPr>
-                <w:rFonts w:ascii="Arial" w:hAnsi="Arial"/>
-                <w:b w:val="0"/>
-                <w:sz w:val="19"/>
-              </w:rPr>
               <w:t>project-analyze</w:t>
             </w:r>
           </w:p>
         </w:tc>
         <w:tc>
           <w:tcPr>
-            <w:tcW w:type="dxa" w:w="6912"/>
+            <w:tcW w:type="dxa" w:w="4320"/>
           </w:tcPr>
           <w:p>
-            <w:pPr>
-              <w:jc w:val="left"/>
-            </w:pPr>
-            <w:r/>
             <w:r>
-              <w:rPr>
-                <w:rFonts w:ascii="Arial" w:hAnsi="Arial"/>
-                <w:b w:val="0"/>
-                <w:sz w:val="19"/>
-              </w:rPr>
               <w:t>분석 전용</w:t>
             </w:r>
           </w:p>
@@ -2518,38 +1554,20 @@
       <w:tr>
         <w:tc>
           <w:tcPr>
-            <w:tcW w:type="dxa" w:w="2448"/>
+            <w:tcW w:type="dxa" w:w="4320"/>
           </w:tcPr>
           <w:p>
-            <w:pPr>
-              <w:jc w:val="left"/>
-            </w:pPr>
-            <w:r/>
             <w:r>
-              <w:rPr>
-                <w:rFonts w:ascii="Arial" w:hAnsi="Arial"/>
-                <w:b w:val="0"/>
-                <w:sz w:val="19"/>
-              </w:rPr>
               <w:t>sample-bootstrap</w:t>
             </w:r>
           </w:p>
         </w:tc>
         <w:tc>
           <w:tcPr>
-            <w:tcW w:type="dxa" w:w="6912"/>
+            <w:tcW w:type="dxa" w:w="4320"/>
           </w:tcPr>
           <w:p>
-            <w:pPr>
-              <w:jc w:val="left"/>
-            </w:pPr>
-            <w:r/>
             <w:r>
-              <w:rPr>
-                <w:rFonts w:ascii="Arial" w:hAnsi="Arial"/>
-                <w:b w:val="0"/>
-                <w:sz w:val="19"/>
-              </w:rPr>
               <w:t>복사 전용</w:t>
             </w:r>
           </w:p>
@@ -2558,38 +1576,20 @@
       <w:tr>
         <w:tc>
           <w:tcPr>
-            <w:tcW w:type="dxa" w:w="2448"/>
+            <w:tcW w:type="dxa" w:w="4320"/>
           </w:tcPr>
           <w:p>
-            <w:pPr>
-              <w:jc w:val="left"/>
-            </w:pPr>
-            <w:r/>
             <w:r>
-              <w:rPr>
-                <w:rFonts w:ascii="Arial" w:hAnsi="Arial"/>
-                <w:b w:val="0"/>
-                <w:sz w:val="19"/>
-              </w:rPr>
               <w:t>environment-check</w:t>
             </w:r>
           </w:p>
         </w:tc>
         <w:tc>
           <w:tcPr>
-            <w:tcW w:type="dxa" w:w="6912"/>
+            <w:tcW w:type="dxa" w:w="4320"/>
           </w:tcPr>
           <w:p>
-            <w:pPr>
-              <w:jc w:val="left"/>
-            </w:pPr>
-            <w:r/>
             <w:r>
-              <w:rPr>
-                <w:rFonts w:ascii="Arial" w:hAnsi="Arial"/>
-                <w:b w:val="0"/>
-                <w:sz w:val="19"/>
-              </w:rPr>
               <w:t>점검/갱신 전용</w:t>
             </w:r>
           </w:p>
@@ -2598,38 +1598,20 @@
       <w:tr>
         <w:tc>
           <w:tcPr>
-            <w:tcW w:type="dxa" w:w="2448"/>
+            <w:tcW w:type="dxa" w:w="4320"/>
           </w:tcPr>
           <w:p>
-            <w:pPr>
-              <w:jc w:val="left"/>
-            </w:pPr>
-            <w:r/>
             <w:r>
-              <w:rPr>
-                <w:rFonts w:ascii="Arial" w:hAnsi="Arial"/>
-                <w:b w:val="0"/>
-                <w:sz w:val="19"/>
-              </w:rPr>
               <w:t>train-model</w:t>
             </w:r>
           </w:p>
         </w:tc>
         <w:tc>
           <w:tcPr>
-            <w:tcW w:type="dxa" w:w="6912"/>
+            <w:tcW w:type="dxa" w:w="4320"/>
           </w:tcPr>
           <w:p>
-            <w:pPr>
-              <w:jc w:val="left"/>
-            </w:pPr>
-            <w:r/>
             <w:r>
-              <w:rPr>
-                <w:rFonts w:ascii="Arial" w:hAnsi="Arial"/>
-                <w:b w:val="0"/>
-                <w:sz w:val="19"/>
-              </w:rPr>
               <w:t>모델 선택, 생성, 변환, 실행 준비 핵심</w:t>
             </w:r>
           </w:p>
@@ -2638,88 +1620,29 @@
       <w:tr>
         <w:tc>
           <w:tcPr>
-            <w:tcW w:type="dxa" w:w="2448"/>
+            <w:tcW w:type="dxa" w:w="4320"/>
           </w:tcPr>
           <w:p>
-            <w:pPr>
-              <w:jc w:val="left"/>
-            </w:pPr>
-            <w:r/>
             <w:r>
-              <w:rPr>
-                <w:rFonts w:ascii="Arial" w:hAnsi="Arial"/>
-                <w:b w:val="0"/>
-                <w:sz w:val="19"/>
-              </w:rPr>
               <w:t>inference-test</w:t>
             </w:r>
           </w:p>
         </w:tc>
         <w:tc>
           <w:tcPr>
-            <w:tcW w:type="dxa" w:w="6912"/>
+            <w:tcW w:type="dxa" w:w="4320"/>
           </w:tcPr>
           <w:p>
-            <w:pPr>
-              <w:jc w:val="left"/>
-            </w:pPr>
-            <w:r/>
             <w:r>
-              <w:rPr>
-                <w:rFonts w:ascii="Arial" w:hAnsi="Arial"/>
-                <w:b w:val="0"/>
-                <w:sz w:val="19"/>
-              </w:rPr>
               <w:t>추론 확인 전용</w:t>
             </w:r>
           </w:p>
         </w:tc>
       </w:tr>
-      <w:tr>
-        <w:tc>
-          <w:tcPr>
-            <w:tcW w:type="dxa" w:w="2448"/>
-          </w:tcPr>
-          <w:p>
-            <w:pPr>
-              <w:jc w:val="left"/>
-            </w:pPr>
-            <w:r/>
-            <w:r>
-              <w:rPr>
-                <w:rFonts w:ascii="Arial" w:hAnsi="Arial"/>
-                <w:b w:val="0"/>
-                <w:sz w:val="19"/>
-              </w:rPr>
-              <w:t>mlflow-verify</w:t>
-            </w:r>
-          </w:p>
-        </w:tc>
-        <w:tc>
-          <w:tcPr>
-            <w:tcW w:type="dxa" w:w="6912"/>
-          </w:tcPr>
-          <w:p>
-            <w:pPr>
-              <w:jc w:val="left"/>
-            </w:pPr>
-            <w:r/>
-            <w:r>
-              <w:rPr>
-                <w:rFonts w:ascii="Arial" w:hAnsi="Arial"/>
-                <w:b w:val="0"/>
-                <w:sz w:val="19"/>
-              </w:rPr>
-              <w:t>MLflow 결과 검증 전용</w:t>
-            </w:r>
-          </w:p>
-        </w:tc>
-      </w:tr>
     </w:tbl>
-    <w:p/>
     <w:sectPr>
       <w:pgSz w:w="12240" w:h="15840"/>
-      <w:pgMar w:top="1440" w:right="1440" w:bottom="1440" w:left="1440" w:header="720" w:footer="720" w:gutter="0"/>
+      <w:pgMar w:top="1440" w:right="1800" w:bottom="1440" w:left="1800" w:header="720" w:footer="720" w:gutter="0"/>
       <w:cols w:space="720"/>
       <w:docGrid w:linePitch="360"/>
     </w:sectPr>
@@ -3090,6 +2013,10 @@
     <w:name w:val="Normal"/>
     <w:qFormat/>
     <w:rsid w:val="00FC693F"/>
+    <w:rPr>
+      <w:rFonts w:ascii="Arial" w:hAnsi="Arial"/>
+      <w:sz w:val="18"/>
+    </w:rPr>
   </w:style>
   <w:style w:type="paragraph" w:styleId="Header">
     <w:name w:val="header"/>

</xml_diff>

<commit_message>
Align AI Studio TODO guide
</commit_message>
<xml_diff>
--- a/.opencode/skills/AIU_Studio_Skill_Explanation_Table.docx
+++ b/.opencode/skills/AIU_Studio_Skill_Explanation_Table.docx
@@ -706,90 +706,6 @@
           </w:tcPr>
           <w:p>
             <w:r>
-              <w:t>워크스페이스 분석</w:t>
-            </w:r>
-          </w:p>
-        </w:tc>
-        <w:tc>
-          <w:tcPr>
-            <w:tcW w:type="dxa" w:w="2160"/>
-          </w:tcPr>
-          <w:p>
-            <w:r>
-              <w:t>프로젝트 분석</w:t>
-            </w:r>
-          </w:p>
-        </w:tc>
-      </w:tr>
-      <w:tr>
-        <w:tc>
-          <w:tcPr>
-            <w:tcW w:type="dxa" w:w="2160"/>
-          </w:tcPr>
-          <w:p>
-            <w:r>
-              <w:t>2</w:t>
-            </w:r>
-          </w:p>
-        </w:tc>
-        <w:tc>
-          <w:tcPr>
-            <w:tcW w:type="dxa" w:w="2160"/>
-          </w:tcPr>
-          <w:p>
-            <w:r>
-              <w:t>01-agent-mlflow-skill-project-analyze</w:t>
-            </w:r>
-          </w:p>
-        </w:tc>
-        <w:tc>
-          <w:tcPr>
-            <w:tcW w:type="dxa" w:w="2160"/>
-          </w:tcPr>
-          <w:p>
-            <w:r>
-              <w:t>모델 있음/없음 확인</w:t>
-            </w:r>
-          </w:p>
-        </w:tc>
-        <w:tc>
-          <w:tcPr>
-            <w:tcW w:type="dxa" w:w="2160"/>
-          </w:tcPr>
-          <w:p>
-            <w:r>
-              <w:t>model_found 확인</w:t>
-            </w:r>
-          </w:p>
-        </w:tc>
-      </w:tr>
-      <w:tr>
-        <w:tc>
-          <w:tcPr>
-            <w:tcW w:type="dxa" w:w="2160"/>
-          </w:tcPr>
-          <w:p>
-            <w:r>
-              <w:t>3</w:t>
-            </w:r>
-          </w:p>
-        </w:tc>
-        <w:tc>
-          <w:tcPr>
-            <w:tcW w:type="dxa" w:w="2160"/>
-          </w:tcPr>
-          <w:p>
-            <w:r>
-              <w:t>01-agent-mlflow-skill-project-analyze</w:t>
-            </w:r>
-          </w:p>
-        </w:tc>
-        <w:tc>
-          <w:tcPr>
-            <w:tcW w:type="dxa" w:w="2160"/>
-          </w:tcPr>
-          <w:p>
-            <w:r>
               <w:t>모델 목록 확인</w:t>
             </w:r>
           </w:p>
@@ -812,7 +728,7 @@
           </w:tcPr>
           <w:p>
             <w:r>
-              <w:t>4</w:t>
+              <w:t>2</w:t>
             </w:r>
           </w:p>
         </w:tc>
@@ -854,7 +770,7 @@
           </w:tcPr>
           <w:p>
             <w:r>
-              <w:t>5</w:t>
+              <w:t>3</w:t>
             </w:r>
           </w:p>
         </w:tc>
@@ -874,7 +790,7 @@
           </w:tcPr>
           <w:p>
             <w:r>
-              <w:t>모델 확인</w:t>
+              <w:t>템플릿 변환</w:t>
             </w:r>
           </w:p>
         </w:tc>
@@ -884,7 +800,7 @@
           </w:tcPr>
           <w:p>
             <w:r>
-              <w:t>선택 모델 경로와 MODEL_KIND 확인</w:t>
+              <w:t>템플릿 복사 + 선택 모델 기준 코드 변환</w:t>
             </w:r>
           </w:p>
         </w:tc>
@@ -896,133 +812,7 @@
           </w:tcPr>
           <w:p>
             <w:r>
-              <w:t>6</w:t>
-            </w:r>
-          </w:p>
-        </w:tc>
-        <w:tc>
-          <w:tcPr>
-            <w:tcW w:type="dxa" w:w="2160"/>
-          </w:tcPr>
-          <w:p>
-            <w:r>
-              <w:t>04-agent-mlflow-skill-train-model</w:t>
-            </w:r>
-          </w:p>
-        </w:tc>
-        <w:tc>
-          <w:tcPr>
-            <w:tcW w:type="dxa" w:w="2160"/>
-          </w:tcPr>
-          <w:p>
-            <w:r>
-              <w:t>폴더 복사</w:t>
-            </w:r>
-          </w:p>
-        </w:tc>
-        <w:tc>
-          <w:tcPr>
-            <w:tcW w:type="dxa" w:w="2160"/>
-          </w:tcPr>
-          <w:p>
-            <w:r>
-              <w:t>prepare_selected_model.py --model ... --execute</w:t>
-            </w:r>
-          </w:p>
-        </w:tc>
-      </w:tr>
-      <w:tr>
-        <w:tc>
-          <w:tcPr>
-            <w:tcW w:type="dxa" w:w="2160"/>
-          </w:tcPr>
-          <w:p>
-            <w:r>
-              <w:t>7</w:t>
-            </w:r>
-          </w:p>
-        </w:tc>
-        <w:tc>
-          <w:tcPr>
-            <w:tcW w:type="dxa" w:w="2160"/>
-          </w:tcPr>
-          <w:p>
-            <w:r>
-              <w:t>04-agent-mlflow-skill-train-model</w:t>
-            </w:r>
-          </w:p>
-        </w:tc>
-        <w:tc>
-          <w:tcPr>
-            <w:tcW w:type="dxa" w:w="2160"/>
-          </w:tcPr>
-          <w:p>
-            <w:r>
-              <w:t>runtest_2.py 생성</w:t>
-            </w:r>
-          </w:p>
-        </w:tc>
-        <w:tc>
-          <w:tcPr>
-            <w:tcW w:type="dxa" w:w="2160"/>
-          </w:tcPr>
-          <w:p>
-            <w:r>
-              <w:t>prepare_selected_model.py --model ... --execute</w:t>
-            </w:r>
-          </w:p>
-        </w:tc>
-      </w:tr>
-      <w:tr>
-        <w:tc>
-          <w:tcPr>
-            <w:tcW w:type="dxa" w:w="2160"/>
-          </w:tcPr>
-          <w:p>
-            <w:r>
-              <w:t>8</w:t>
-            </w:r>
-          </w:p>
-        </w:tc>
-        <w:tc>
-          <w:tcPr>
-            <w:tcW w:type="dxa" w:w="2160"/>
-          </w:tcPr>
-          <w:p>
-            <w:r>
-              <w:t>04-agent-mlflow-skill-train-model</w:t>
-            </w:r>
-          </w:p>
-        </w:tc>
-        <w:tc>
-          <w:tcPr>
-            <w:tcW w:type="dxa" w:w="2160"/>
-          </w:tcPr>
-          <w:p>
-            <w:r>
-              <w:t>선택 모델 기준 템플릿 변환</w:t>
-            </w:r>
-          </w:p>
-        </w:tc>
-        <w:tc>
-          <w:tcPr>
-            <w:tcW w:type="dxa" w:w="2160"/>
-          </w:tcPr>
-          <w:p>
-            <w:r>
-              <w:t>prepare_selected_model.py --model ... --execute</w:t>
-            </w:r>
-          </w:p>
-        </w:tc>
-      </w:tr>
-      <w:tr>
-        <w:tc>
-          <w:tcPr>
-            <w:tcW w:type="dxa" w:w="2160"/>
-          </w:tcPr>
-          <w:p>
-            <w:r>
-              <w:t>9</w:t>
+              <w:t>4</w:t>
             </w:r>
           </w:p>
         </w:tc>
@@ -1042,7 +832,7 @@
           </w:tcPr>
           <w:p>
             <w:r>
-              <w:t>환경 점검</w:t>
+              <w:t>환경변수/requirements 갱신</w:t>
             </w:r>
           </w:p>
         </w:tc>
@@ -1064,7 +854,7 @@
           </w:tcPr>
           <w:p>
             <w:r>
-              <w:t>10</w:t>
+              <w:t>5</w:t>
             </w:r>
           </w:p>
         </w:tc>
@@ -1084,7 +874,7 @@
           </w:tcPr>
           <w:p>
             <w:r>
-              <w:t>MLflow 등록 실행</w:t>
+              <w:t>원격 MLflow 등록 실행</w:t>
             </w:r>
           </w:p>
         </w:tc>
@@ -1106,7 +896,7 @@
           </w:tcPr>
           <w:p>
             <w:r>
-              <w:t>11</w:t>
+              <w:t>6</w:t>
             </w:r>
           </w:p>
         </w:tc>
@@ -1148,7 +938,7 @@
           </w:tcPr>
           <w:p>
             <w:r>
-              <w:t>12</w:t>
+              <w:t>7</w:t>
             </w:r>
           </w:p>
         </w:tc>
@@ -1168,7 +958,7 @@
           </w:tcPr>
           <w:p>
             <w:r>
-              <w:t>오류 시 실패 단계부터 재실행</w:t>
+              <w:t>오류 수정 및 재실행</w:t>
             </w:r>
           </w:p>
         </w:tc>
@@ -1241,7 +1031,7 @@
           </w:tcPr>
           <w:p>
             <w:r>
-              <w:t>워크스페이스를 분석</w:t>
+              <w:t>모델 목록을 확인</w:t>
             </w:r>
           </w:p>
         </w:tc>
@@ -1263,7 +1053,7 @@
           </w:tcPr>
           <w:p>
             <w:r>
-              <w:t>모델 있음/없음을 확인</w:t>
+              <w:t>사용할 모델을 선택</w:t>
             </w:r>
           </w:p>
         </w:tc>
@@ -1285,7 +1075,7 @@
           </w:tcPr>
           <w:p>
             <w:r>
-              <w:t>모델 목록을 확인</w:t>
+              <w:t>템플릿 복사와 코드 변환</w:t>
             </w:r>
           </w:p>
         </w:tc>
@@ -1307,7 +1097,7 @@
           </w:tcPr>
           <w:p>
             <w:r>
-              <w:t>사용할 모델을 선택</w:t>
+              <w:t>환경변수와 requirements 갱신</w:t>
             </w:r>
           </w:p>
         </w:tc>
@@ -1329,7 +1119,7 @@
           </w:tcPr>
           <w:p>
             <w:r>
-              <w:t>선택한 모델 경로와 형식을 확인</w:t>
+              <w:t>원격 MLflow 등록 실행</w:t>
             </w:r>
           </w:p>
         </w:tc>
@@ -1351,7 +1141,7 @@
           </w:tcPr>
           <w:p>
             <w:r>
-              <w:t>템플릿 폴더를 현재 워크스페이스 루트로 복사</w:t>
+              <w:t>추론 테스트</w:t>
             </w:r>
           </w:p>
         </w:tc>
@@ -1364,116 +1154,6 @@
           <w:p>
             <w:r>
               <w:t>7</w:t>
-            </w:r>
-          </w:p>
-        </w:tc>
-        <w:tc>
-          <w:tcPr>
-            <w:tcW w:type="dxa" w:w="4320"/>
-          </w:tcPr>
-          <w:p>
-            <w:r>
-              <w:t>runtest.py를 참조해서 runtest_2.py 생성</w:t>
-            </w:r>
-          </w:p>
-        </w:tc>
-      </w:tr>
-      <w:tr>
-        <w:tc>
-          <w:tcPr>
-            <w:tcW w:type="dxa" w:w="4320"/>
-          </w:tcPr>
-          <w:p>
-            <w:r>
-              <w:t>8</w:t>
-            </w:r>
-          </w:p>
-        </w:tc>
-        <w:tc>
-          <w:tcPr>
-            <w:tcW w:type="dxa" w:w="4320"/>
-          </w:tcPr>
-          <w:p>
-            <w:r>
-              <w:t>선택 모델 기준으로 템플릿 변환</w:t>
-            </w:r>
-          </w:p>
-        </w:tc>
-      </w:tr>
-      <w:tr>
-        <w:tc>
-          <w:tcPr>
-            <w:tcW w:type="dxa" w:w="4320"/>
-          </w:tcPr>
-          <w:p>
-            <w:r>
-              <w:t>9</w:t>
-            </w:r>
-          </w:p>
-        </w:tc>
-        <w:tc>
-          <w:tcPr>
-            <w:tcW w:type="dxa" w:w="4320"/>
-          </w:tcPr>
-          <w:p>
-            <w:r>
-              <w:t>환경 점검</w:t>
-            </w:r>
-          </w:p>
-        </w:tc>
-      </w:tr>
-      <w:tr>
-        <w:tc>
-          <w:tcPr>
-            <w:tcW w:type="dxa" w:w="4320"/>
-          </w:tcPr>
-          <w:p>
-            <w:r>
-              <w:t>10</w:t>
-            </w:r>
-          </w:p>
-        </w:tc>
-        <w:tc>
-          <w:tcPr>
-            <w:tcW w:type="dxa" w:w="4320"/>
-          </w:tcPr>
-          <w:p>
-            <w:r>
-              <w:t>MLflow 등록 실행</w:t>
-            </w:r>
-          </w:p>
-        </w:tc>
-      </w:tr>
-      <w:tr>
-        <w:tc>
-          <w:tcPr>
-            <w:tcW w:type="dxa" w:w="4320"/>
-          </w:tcPr>
-          <w:p>
-            <w:r>
-              <w:t>11</w:t>
-            </w:r>
-          </w:p>
-        </w:tc>
-        <w:tc>
-          <w:tcPr>
-            <w:tcW w:type="dxa" w:w="4320"/>
-          </w:tcPr>
-          <w:p>
-            <w:r>
-              <w:t>추론 테스트</w:t>
-            </w:r>
-          </w:p>
-        </w:tc>
-      </w:tr>
-      <w:tr>
-        <w:tc>
-          <w:tcPr>
-            <w:tcW w:type="dxa" w:w="4320"/>
-          </w:tcPr>
-          <w:p>
-            <w:r>
-              <w:t>12</w:t>
             </w:r>
           </w:p>
         </w:tc>

</xml_diff>